<commit_message>
fix: all generators handle references.items + _format_reference helper
</commit_message>
<xml_diff>
--- a/backend/tools/Journal/IJT_output.docx
+++ b/backend/tools/Journal/IJT_output.docx
@@ -10,7 +10,7 @@
         <w:rPr>
           <w:b/>
         </w:rPr>
-        <w:t>Perancangan Sistem Kendali PID pada Lengan Robot Industri untuk Peningkatan Presisi Pengelasan Komponen Otomotif</w:t>
+        <w:t>Sel Hibrida Solar-Lunar: Integrasi Fotovoltaik dan Konverter Termoradiatif untuk Pembangkitan Daya Berkelanjutan</w:t>
       </w:r>
     </w:p>
     <w:p>
@@ -18,7 +18,7 @@
         <w:pStyle w:val="IJTechaffiliation"/>
       </w:pPr>
       <w:r>
-        <w:t>Annabil Hisyam</w:t>
+        <w:t>Fikri Fahlevy</w:t>
       </w:r>
       <w:r>
         <w:rPr>
@@ -41,7 +41,7 @@
         <w:pStyle w:val="IJTechaffiliation"/>
       </w:pPr>
       <w:r>
-        <w:t>*Corresponding author: Annabil Hisyam; Email: annabilhisyammuyassa@students.undip.ac.id; Tel: +62-24-7055-1111; Fax: +62-24-7055-2222</w:t>
+        <w:t>*Corresponding author: Fikri Fahlevy; Email: fikri.fahlevy@live.undip.ac.id; Tel: +62-24-7055-1111; Fax: +62-24-7055-2222</w:t>
       </w:r>
     </w:p>
     <w:p>
@@ -55,7 +55,7 @@
         <w:t xml:space="preserve">Abstract </w:t>
       </w:r>
       <w:r>
-        <w:t>(1) Background: Presisi pengelasan pada lengan robot industri menjadi faktor krusial dalam produksi komponen otomotif, namun gangguan eksternal dan non-linearitas aktuator sering menyebabkan deviasi lintasan. (2) Purpose/Aim: Penelitian ini merancang sistem kendali Proporsional-Integral-Derivatif (PID) yang dioptimalkan untuk meningkatkan akurasi posisi ujung lengan robot pada proses pengelasan titik. (3) Methods: Metode meliputi pemodelan kinematik lengan robot enam derajat kebebasan menggunakan transformasi Denavit-Hartenberg, penentuan parameter PID melalui metode Ziegler-Nichols, serta simulasi menggunakan MATLAB/Simulink. (4) Results: Hasil simulasi menunjukkan bahwa sistem kendali PID mampu mengurangi kesalahan keadaan tunak hingga nilai X₁ mm dan waktu naik X₂ detik. dengan overshoot maksimum X₃ persen. Dibandingkan dengan kendali proporsional murni dan kendali on-off, PID memberikan perbaikan waktu penetapan sebesar X₄ persen dan penurunan overshoot sebesar X₅ persen. (5) Conclusions: Temuan ini mengindikasikan bahwa kendali PID dapat diandalkan untuk aplikasi pengelasan robotik yang memerlukan presisi tinggi.</w:t>
+        <w:t>(1) Background: Kebutuhan energi global terus mendesak batas kapasitas pembangkitan surya konvensional. Masalah utamanya? (2) Purpose/Aim: Sel fotovoltaik (PV) mati total saat malam tiba. Celah intermitensi ini memaksa ketergantungan pada baterai yang mahal dan secara ekologis bermasalah. (3) Methods: Konverter termoradiatif (TRC) muncul sebagai alternatif — menghasilkan listrik dengan memancarkan panas ke langit malam yang dingin — tapi daya keluarannya secara inheren rendah. Paper ini mengusulkan arsitektur Sel Hibrida Solar-Lunar yang menggabungkan PV dan TRC dalam satu struktur termal terkopel. (4) Results: Kami memodelkan batas termodinamika dan mensimulasikan kinerja siklus diurnal menggunakan variabel deskriptif (P_PV, P_TRC, η_total). Hasil analisis menunjukkan bahwa kopling termal memungkinkan TRC memanfaatkan limbah panas PV di siang hari, sementara pada malam hari sistem beralih ke mode emisi radiatif murni. (5) Conclusions: Temuan ini membuka jalan bagi pembangkitan daya 24 jam tanpa jeda, mengurangi kebutuhan kapasitas penyimpanan energi secara signifikan.</w:t>
       </w:r>
     </w:p>
     <w:p>
@@ -73,7 +73,7 @@
         <w:rPr>
           <w:i/>
         </w:rPr>
-        <w:t xml:space="preserve"> Kendali PID; Lengan robot; Pengelasan otomotif; Presisi; Simulasi MATLAB</w:t>
+        <w:t xml:space="preserve"> Energi Berkelanjutan; Fotovoltaik; Kopling Termal; Sel Hibrida; Termoradiatif</w:t>
       </w:r>
     </w:p>
     <w:p>
@@ -90,7 +90,7 @@
         <w:ind w:firstLine="283"/>
       </w:pPr>
       <w:r>
-        <w:t>Industri otomotif global terus mendorong peningkatan produktivitas dan kualitas melalui otomatisasi proses produksi. Salah satu proses yang menuntut presisi tinggi adalah pengelasan komponen bodi kendaraan, di mana deviasi posisi ujung lengan robot dapat menyebabkan cacat sambungan (Kadir, 2015). Lengan robot enam sumbu telah diadopsi secara luas karena fleksibilitasnya, tetapi ketidaklinearan aktuator dan gesekan sendi menimbulkan tantangan dalam kontrol lintasan. Oleh karena itu, diperlukan sistem kendali yang mampu mempertahankan akurasi posisi sepanjang lintasan pengelasan.</w:t>
+        <w:t>Matahari adalah sumber energi paling melimpah di planet ini, tapi ia punya kelemahan fatal: ia terbenam. Ketergantungan global pada fotovoltaik (PV) menciptakan jurang pasokan setiap malam, memaksa grid listrik bertumpu pada pembangkit fosil cadangan atau bank baterai raksasa [1]. Baterai lithium-ion, meski dominan saat ini, membawa jejak ekologis yang berat dari proses penambangan hingga pembuangan akhir [2]. Kami tak bisa sekadar menambah kapasitas panel surya untuk menyelesaikan masalah yang berakar pada rotasi bumi ini. Intermitensi bukan sekadar masalah teknis; ia adalah batasan fundamental dari teknologi yang hanya mengandalkan satu arah aliran foton.</w:t>
       </w:r>
     </w:p>
     <w:p>
@@ -99,7 +99,7 @@
         <w:ind w:firstLine="283"/>
       </w:pPr>
       <w:r>
-        <w:t>Penelitian sebelumnya telah mengeksplorasi berbagai strategi kendali untuk lengan robot. Kendali Proporsional-Integral-Derivatif (PID) tetap menjadi pilihan utama karena kesederhanaan dan efektivitasnya dalam banyak aplikasi industri (Astrom, 2006), namun, parameter tetap PID seringkali tidak mencukupi saat menghadapi beban variabel dan perubahan lingkungan (Visioli, 2006). Hal ini mendorong pengembangan metode adaptif dan penalaan otomatis, termasuk penggunaan algoritma optimasi seperti Particle Swarm Optimization (PSO) dan Genetic Algorithm (GA). Meskipun demikian, implementasi metode tersebut memerlukan sumber daya komputasi yang lebih besar dan belum tentu sesuai untuk sistem lengan robot skala kecil-menengah (Kim, 2018).</w:t>
+        <w:t>Di sisi lain spektrum teknologi, konverter termoradiatif (TRC) menawarkan janji yang berlawanan [3]. Alih-alih menyerap foton dari bintang, sel TRC menghasilkan listrik dengan memancarkan foton inframerah ke luar angkasa yang bersuhu ~3 K [4]. Prinsip termodinamika ini — memanfaatkan gradien suhu antara bumi dan langit malam — secara teoretis mampu menghasilkan daya kontinu 24 jam [5]. Tapi apakah ini cukup untuk skala industri, and Nyatanya, tidak. Densitas daya TRC mandiri saat ini masih terjebak di kisaran ~2 W/m², jauh di bawah ambang batas kelayakan komersial [6].</w:t>
       </w:r>
     </w:p>
     <w:p>
@@ -108,7 +108,7 @@
         <w:ind w:firstLine="283"/>
       </w:pPr>
       <w:r>
-        <w:t>Kesenjangan penelitian yang teridentifikasi adalah belum adanya studi yang secara spesifik merancang dan menguji kendali PID untuk pengelasan titik pada komponen otomotif dengan mempertimbangkan karakteristik beban dinamis dan gangguan eksternal. Sebagian besar penelitian berfokus pada aplikasi robot bongkar muat atau perakitan yang memiliki tuntutan presisi lebih rendah (Purnomo, 2020). Oleh karena itu, penelitian ini bertujuan merancang sistem kendali PID yang dituning dengan metode Ziegler-Nichols dan memvalidasi kinerjanya melalui simulasi yang merepresentasikan skenario pengelasan sebenarnya.</w:t>
+        <w:t>Material semikonduktor celah pita sempit seperti InAs atau HgCdTe memang ideal untuk emisi inframerah, namun efisiensi konversinya anjlok saat suhu ambien berfluktuasi [7]. Peneliti sebelumnya cenderung memperlakukan PV dan TRC sebagai entitas yang terpisah; siang milik PV, malam milik TRC [8]. Pemisahan biner ini mengabaikan potensi sinergi termal yang sangat besar. Limbah panas dari sel PV siang hari — yang biasanya menurunkan efisiensi fotovoltaik — sebenarnya bisa menjadi sumber energi termal bagi TRC jika arsitekturnya dirancang ulang [9].</w:t>
       </w:r>
     </w:p>
     <w:p>
@@ -117,7 +117,7 @@
         <w:ind w:firstLine="283"/>
       </w:pPr>
       <w:r>
-        <w:t>Kontribusi spesifik penelitian ini meliputi:</w:t>
+        <w:t>Di sinilah letak celah penelitian yang kami incar. Menggabungkan keduanya bukan sekadar menumpuk dua lapisan material secara fisik, melainkan merancang kopling termal dan spektral yang dinamis [10]. Paper ini mengajukan tiga kontribusi utama: • Merumuskan model termodinamika terkopel untuk arsitektur Sel Hibrida Solar-Lunar. • Mengevaluasi batas efisiensi teoretis (η_hybrid) di bawah variasi gradien suhu diurnal. • Mensimulasikan profil pembangkitan energi harian (E_daily) menggunakan parameter material semikonduktor celah pita ganda.</w:t>
       </w:r>
     </w:p>
     <w:p>
@@ -126,7 +126,15 @@
         <w:ind w:firstLine="283"/>
       </w:pPr>
       <w:r>
-        <w:t>• Perancangan model kinematik lengan robot enam derajat kebebasan untuk lintasan pengelasan komponen otomotif.</w:t>
+        <w:t>Sisa paper ini disusun sebagai berikut. Bagian 2 membedah literatur dan kerangka teoretis yang mendasari emisi radiatif. Bagian 3 merinci metodologi, arsitektur sistem, dan persamaan matematis. Bagian 4 menyajikan hasil simulasi dan analisis trade-off termal, sebelum ditutup dengan kesimpulan dan arah riset masa depan pada Bagian 5.</w:t>
+      </w:r>
+    </w:p>
+    <w:p>
+      <w:pPr>
+        <w:pStyle w:val="IJTechHeadingSection"/>
+      </w:pPr>
+      <w:r>
+        <w:t>TINJAUAN PUSTAKA</w:t>
       </w:r>
     </w:p>
     <w:p>
@@ -135,7 +143,15 @@
         <w:ind w:firstLine="283"/>
       </w:pPr>
       <w:r>
-        <w:t>• Penentuan parameter PID optimal menggunakan metode Ziegler-Nichols kedua yang disesuaikan dengan respons loop tertutup.</w:t>
+        <w:t>Bagian ini meninjau evolusi teknologi pembangkitan surya dan kemunculan konsep termoradiatif, mengidentifikasi di mana paradigma saat ini gagal menjembatani celah energi malam hari.</w:t>
+      </w:r>
+    </w:p>
+    <w:p>
+      <w:pPr>
+        <w:pStyle w:val="IJTechSubheading"/>
+      </w:pPr>
+      <w:r>
+        <w:t>Tinjauan Penelitian Terdahulu</w:t>
       </w:r>
     </w:p>
     <w:p>
@@ -144,7 +160,7 @@
         <w:ind w:firstLine="283"/>
       </w:pPr>
       <w:r>
-        <w:t>• Analisis komparatif kinerja kendali PID terhadap kendali proporsional murni dan kendali on-off pada indikator overshoot, waktu naik, waktu penetapan, dan kesalahan keadaan tunak.</w:t>
+        <w:t>Evolusi sel surya telah mendekati batas teoretisnya. Shockley dan Queisser menetapkan batas efisiensi ~33.7% untuk sel sambungan p-n tunggal, sebuah angka yang nyaris tak tersentuh oleh silikon komersial [11]. Upaya menembus batas ini melalui sel tandem multi-sambungan memang berhasil di laboratorium, tapi biaya fabrikasinya mencekik untuk instalasi massal [12]. Di luar batas efisiensi, masalah intermitensi tetap tak terpecahkan. Panel surya menghasilkan nol watt saat malam. menciptakan kurva bebek (duck curve) yang memusingkan operator grid dan memaksa pembangkitan fosil tetap menyala dalam mode siaga [13].</w:t>
       </w:r>
     </w:p>
     <w:p>
@@ -153,7 +169,7 @@
         <w:ind w:firstLine="283"/>
       </w:pPr>
       <w:r>
-        <w:t>• Rekomendasi parameter awal untuk implementasi nyata pada pengontrol lengan robot berbasis mikrokontroler atau PLC.</w:t>
+        <w:t>Konsep termoradiatif pertama kali diformalkan secara rigor oleh Byrnes dkk. (2014), yang membuktikan bahwa sel yang menghadap ke langit malam dapat menghasilkan arus negatif melalui emisi foton [14]. Sejak itu, berbagai kelompok riset bereksperimen dengan material celah pita sempit. Munday (2019) menunjukkan bahwa TRC bisa menghasilkan daya malam hari, meski dengan densitas yang sangat kecil [15]. Zhang dkk. (2021) meningkatkan angka ini dengan struktur nano-fotonik, namun kompleksitas manufakturnya menjadikannya tak praktis untuk instalasi atap [16].</w:t>
       </w:r>
     </w:p>
     <w:p>
@@ -162,15 +178,15 @@
         <w:ind w:firstLine="283"/>
       </w:pPr>
       <w:r>
-        <w:t>Sistematika penulisan paper ini adalah sebagai berikut. Bagian 2 menyajikan tinjauan pustaka mencakup penelitian terdahulu dan kerangka teoritis kendali PID serta pemodelan robot. Bagian 3 menjelaskan metodologi perancangan, termasuk pemodelan kinematik, penalaan PID, dan prosedur simulasi. Bagian 4 memaparkan hasil simulasi serta pembahasan yang membandingkan dengan metode lain. Bagian 5 memberikan kesimpulan dan saran untuk penelitian selanjutnya.</w:t>
-      </w:r>
-    </w:p>
-    <w:p>
-      <w:pPr>
-        <w:pStyle w:val="IJTechHeadingSection"/>
-      </w:pPr>
-      <w:r>
-        <w:t>TINJAUAN PUSTAKA</w:t>
+        <w:t>Beberapa studi awal mencoba menggabungkan konsep ini, and Chen dkk. (2022) mengusulkan sistem hibrida, tapi mereka menggunakan sakelar mekanis dan optik untuk memisahkan mode siang dan malam [17]. Ini menciptakan titik kegagalan fisik dan rugi-rugi termal pada antarmuka. Kami berargumen bahwa hibridisasi sejati harus terjadi di tingkat kuantum dan termal secara simultan, tanpa bagian yang bergerak [18]. Pendekatan pasif ini menuntut pemahaman mendalam tentang bagaimana foton dan fonon berinteraksi di dalam struktur multilapisan.</w:t>
+      </w:r>
+    </w:p>
+    <w:p>
+      <w:pPr>
+        <w:pStyle w:val="IJTechSubheading"/>
+      </w:pPr>
+      <w:r>
+        <w:t>Kerangka Teoritis</w:t>
       </w:r>
     </w:p>
     <w:p>
@@ -179,598 +195,7 @@
         <w:ind w:firstLine="283"/>
       </w:pPr>
       <w:r>
-        <w:t>Tinjauan pustaka ini mengkaji studi-studi terkait kendali posisi lengan robot serta kerangka teoritis yang mendasari perancangan sistem kendali PID untuk pengelasan.</w:t>
-      </w:r>
-    </w:p>
-    <w:p>
-      <w:pPr>
-        <w:pStyle w:val="IJTechSubheading"/>
-      </w:pPr>
-      <w:r>
-        <w:t>Tinjauan Penelitian Terdahulu</w:t>
-      </w:r>
-    </w:p>
-    <w:p>
-      <w:pPr>
-        <w:pStyle w:val="IJTechText"/>
-        <w:ind w:firstLine="283"/>
-      </w:pPr>
-      <w:r>
-        <w:t>Penelitian di bidang kendali lengan robot telah banyak dilakukan dengan berbagai pendekatan. Smith et al. (Smith, 2019) mengimplementasikan kendali PID adaptif menggunakan algoritma Recursive Least Squares (RLS) pada lengan robot 3-DOF. Hasil eksperimen menunjukkan pengurangan kesalahan jejak sebesar Y₁ mm dibandingkan PID tetap, namun, metode ini memerlukan pembaruan parameter secara online yang membebani prosesor.</w:t>
-      </w:r>
-    </w:p>
-    <w:p>
-      <w:pPr>
-        <w:pStyle w:val="IJTechText"/>
-        <w:ind w:firstLine="283"/>
-      </w:pPr>
-      <w:r>
-        <w:t>Chen dan Li (Chen, 2020) mengusulkan kendali PID berbasis jaringan syaraf tiruan untuk kompensasi gesekan pada sendi robot. Skema ini berhasil menurunkan overshoot hingga Y₂ persen tetapi memakan waktu pelatihan yang panjang, sementara itu, Kumar et al. (Kumar, 2021) membandingkan kinerja PID dengan kendali logika fuzzy pada lengan robot pengelasan. Mereka melaporkan bahwa kendali fuzzy unggul dalam menangani non-linearitas, namun implementasinya lebih kompleks.</w:t>
-      </w:r>
-    </w:p>
-    <w:p>
-      <w:pPr>
-        <w:pStyle w:val="IJTechText"/>
-        <w:ind w:firstLine="283"/>
-      </w:pPr>
-      <w:r>
-        <w:t>Dalam domain pengelasan robotik, Gonzalez et al. (Gonzalez, 2017) merancang kendali solid H_∞ untuk menjaga kualitas las meskipun ada gangguan. Pendekatan tersebut memberikan jaminan stabilitas tetapi menghasilkan pengontrol orde tinggi yang sulit direalisasikan pada pengontrol industri murah. Penelitian lain oleh Park dan Kim (Park, 2022) berfokus pada penalaan PID otomatis menggunakan optimasi Particle Swarm (PSO) untuk robot SCARA. memperoleh waktu penetapan rata-rata Y₃ detik.</w:t>
-      </w:r>
-    </w:p>
-    <w:p>
-      <w:pPr>
-        <w:pStyle w:val="IJTechText"/>
-        <w:ind w:firstLine="283"/>
-      </w:pPr>
-      <w:r>
-        <w:t>Keterbatasan yang terlihat dari penelitian-penelitian tersebut adalah: (1) sebagian besar menggunakan lengan robot dengan jumlah sumbu terbatas (3 atau 4 DOF), (2) beban yang digunakan tidak mewakili kondisi pengelasan titik dengan massa elektroda dan gaya kontak, dan (3) tidak ada yang secara eksplisit mempertimbangkan gangguan dari pergerakan konveyor atau getaran mesin. Oleh karena itu, penelitian ini mengisi gap dengan merancang PID untuk lengan robot 6-DOF pada skenario pengelasan komponen otomotif yang mencakup beban variabel.</w:t>
-      </w:r>
-    </w:p>
-    <w:p>
-      <w:pPr>
-        <w:pStyle w:val="IJTechText"/>
-        <w:ind w:firstLine="283"/>
-      </w:pPr>
-      <w:r>
-        <w:t>Selain itu, beberapa studi menggunakan data eksperimental nyata, namun penelitian ini memanfaatkan simulasi untuk menyediakan baseline perbandingan yang terkontrol. Hal ini penting karena variasi kondisi lapangan sulit direproduksi secara konsisten (Wang, 2016).</w:t>
-      </w:r>
-    </w:p>
-    <w:p>
-      <w:pPr>
-        <w:pStyle w:val="IJTechSubheading"/>
-      </w:pPr>
-      <w:r>
-        <w:t>Kerangka Teoritis</w:t>
-      </w:r>
-    </w:p>
-    <w:p>
-      <w:pPr>
-        <w:pStyle w:val="IJTechText"/>
-        <w:ind w:firstLine="283"/>
-      </w:pPr>
-      <w:r>
-        <w:t>Sistem kendali PID terdiri dari tiga komponen: aksi proporsional (P), integral (I), dan derivatif (D). Persamaan kendali PID kontinu dinyatakan oleh</w:t>
-      </w:r>
-    </w:p>
-    <w:p>
-      <w:pPr>
-        <w:pStyle w:val="IJTechText"/>
-        <w:jc w:val="center"/>
-      </w:pPr>
-      <m:oMath xmlns:mml="http://www.w3.org/1998/Math/MathML">
-        <m:r>
-          <m:t>u(t)=</m:t>
-        </m:r>
-        <m:sSub>
-          <m:e>
-            <m:r>
-              <m:t>K</m:t>
-            </m:r>
-          </m:e>
-          <m:sub>
-            <m:r>
-              <m:t>p</m:t>
-            </m:r>
-          </m:sub>
-        </m:sSub>
-        <m:r>
-          <m:t>e(t)+</m:t>
-        </m:r>
-        <m:sSub>
-          <m:e>
-            <m:r>
-              <m:t>K</m:t>
-            </m:r>
-          </m:e>
-          <m:sub>
-            <m:r>
-              <m:t>i</m:t>
-            </m:r>
-          </m:sub>
-        </m:sSub>
-        <m:nary>
-          <m:naryPr>
-            <m:chr m:val="∫"/>
-            <m:limLoc m:val="subSup"/>
-            <m:grow m:val="1"/>
-            <m:subHide m:val="off"/>
-            <m:supHide m:val="off"/>
-          </m:naryPr>
-          <m:sub>
-            <m:r>
-              <m:t>0</m:t>
-            </m:r>
-          </m:sub>
-          <m:sup>
-            <m:r>
-              <m:t>t</m:t>
-            </m:r>
-          </m:sup>
-          <m:e/>
-        </m:nary>
-        <m:r>
-          <m:t>e(τ)dτ+</m:t>
-        </m:r>
-        <m:sSub>
-          <m:e>
-            <m:r>
-              <m:t>K</m:t>
-            </m:r>
-          </m:e>
-          <m:sub>
-            <m:r>
-              <m:t>d</m:t>
-            </m:r>
-          </m:sub>
-        </m:sSub>
-        <m:f>
-          <m:fPr>
-            <m:type m:val="bar"/>
-          </m:fPr>
-          <m:num>
-            <m:r>
-              <m:t>de(t)</m:t>
-            </m:r>
-          </m:num>
-          <m:den>
-            <m:r>
-              <m:t>dt</m:t>
-            </m:r>
-          </m:den>
-        </m:f>
-      </m:oMath>
-      <w:r>
-        <w:tab/>
-        <w:t>(1)</w:t>
-      </w:r>
-    </w:p>
-    <w:p>
-      <w:pPr>
-        <w:pStyle w:val="IJTechText"/>
-        <w:ind w:firstLine="283"/>
-      </w:pPr>
-      <w:r>
-        <w:t>dengan u(t) adalah sinyal kontrol, e(t) adalah error posisi (selisih antara posisi referensi dan aktual), K_p adalah gain proporsional, K_i adalah gain integral, K_d adalah gain derivatif. Komponen P mengurangi error saat ini, komponen I menghilangkan offset keadaan tunak, dan komponen D memberikan efek antisipatif terhadap perubahan error. Penalaan parameter PID yang tepat sangat penting untuk mencapai trade-off antara respons cepat dan kestabilan.</w:t>
-      </w:r>
-    </w:p>
-    <w:p>
-      <w:pPr>
-        <w:pStyle w:val="IJTechText"/>
-        <w:ind w:firstLine="283"/>
-      </w:pPr>
-      <w:r>
-        <w:t>Pemodelan kinematik lengan robot menggunakan parameter Denavit-Hartenberg (DH) menyediakan hubungan antara sudut sendi dengan posisi dan orientasi ujung lengan. Matriks transformasi homogen T_i^i-1 untuk sendi ke-i didefinisikan oleh parameter θ_i, d_i, a_i, dan α_i. Rantai kinematik total diperoleh dengan perkalian matriks: T₆⁰ = T₁⁰ T₂¹ ... T₆⁵.</w:t>
-      </w:r>
-    </w:p>
-    <w:p>
-      <w:pPr>
-        <w:pStyle w:val="IJTechText"/>
-        <w:jc w:val="center"/>
-      </w:pPr>
-      <m:oMath xmlns:mml="http://www.w3.org/1998/Math/MathML">
-        <m:sSub>
-          <m:e>
-            <m:r>
-              <m:t>T</m:t>
-            </m:r>
-          </m:e>
-          <m:sub>
-            <m:r>
-              <m:t>i</m:t>
-            </m:r>
-          </m:sub>
-        </m:sSub>
-        <m:r>
-          <m:t>i−1=[</m:t>
-        </m:r>
-        <m:m>
-          <m:mPr>
-            <m:baseJc m:val="center"/>
-            <m:plcHide m:val="on"/>
-            <m:mcs>
-              <m:mc>
-                <m:mcPr>
-                  <m:count m:val="4"/>
-                  <m:mcJc m:val="center"/>
-                </m:mcPr>
-              </m:mc>
-            </m:mcs>
-          </m:mPr>
-          <m:mr>
-            <m:e>
-              <m:r>
-                <m:rPr>
-                  <m:sty m:val="p"/>
-                </m:rPr>
-                <m:t>cos</m:t>
-              </m:r>
-              <m:sSub>
-                <m:e>
-                  <m:r>
-                    <m:t>θ</m:t>
-                  </m:r>
-                </m:e>
-                <m:sub>
-                  <m:r>
-                    <m:t>i</m:t>
-                  </m:r>
-                </m:sub>
-              </m:sSub>
-            </m:e>
-            <m:e>
-              <m:r>
-                <m:t>−</m:t>
-              </m:r>
-              <m:r>
-                <m:rPr>
-                  <m:sty m:val="p"/>
-                </m:rPr>
-                <m:t>sin</m:t>
-              </m:r>
-              <m:sSub>
-                <m:e>
-                  <m:r>
-                    <m:t>θ</m:t>
-                  </m:r>
-                </m:e>
-                <m:sub>
-                  <m:r>
-                    <m:t>i</m:t>
-                  </m:r>
-                </m:sub>
-              </m:sSub>
-              <m:r>
-                <m:rPr>
-                  <m:sty m:val="p"/>
-                </m:rPr>
-                <m:t>cos</m:t>
-              </m:r>
-              <m:sSub>
-                <m:e>
-                  <m:r>
-                    <m:t>α</m:t>
-                  </m:r>
-                </m:e>
-                <m:sub>
-                  <m:r>
-                    <m:t>i</m:t>
-                  </m:r>
-                </m:sub>
-              </m:sSub>
-            </m:e>
-            <m:e>
-              <m:r>
-                <m:rPr>
-                  <m:sty m:val="p"/>
-                </m:rPr>
-                <m:t>sin</m:t>
-              </m:r>
-              <m:sSub>
-                <m:e>
-                  <m:r>
-                    <m:t>θ</m:t>
-                  </m:r>
-                </m:e>
-                <m:sub>
-                  <m:r>
-                    <m:t>i</m:t>
-                  </m:r>
-                </m:sub>
-              </m:sSub>
-              <m:r>
-                <m:rPr>
-                  <m:sty m:val="p"/>
-                </m:rPr>
-                <m:t>sin</m:t>
-              </m:r>
-              <m:sSub>
-                <m:e>
-                  <m:r>
-                    <m:t>α</m:t>
-                  </m:r>
-                </m:e>
-                <m:sub>
-                  <m:r>
-                    <m:t>i</m:t>
-                  </m:r>
-                </m:sub>
-              </m:sSub>
-            </m:e>
-            <m:e>
-              <m:sSub>
-                <m:e>
-                  <m:r>
-                    <m:t>a</m:t>
-                  </m:r>
-                </m:e>
-                <m:sub>
-                  <m:r>
-                    <m:t>i</m:t>
-                  </m:r>
-                </m:sub>
-              </m:sSub>
-              <m:r>
-                <m:rPr>
-                  <m:sty m:val="p"/>
-                </m:rPr>
-                <m:t>cos</m:t>
-              </m:r>
-              <m:sSub>
-                <m:e>
-                  <m:r>
-                    <m:t>θ</m:t>
-                  </m:r>
-                </m:e>
-                <m:sub>
-                  <m:r>
-                    <m:t>i</m:t>
-                  </m:r>
-                </m:sub>
-              </m:sSub>
-            </m:e>
-          </m:mr>
-          <m:mr>
-            <m:e>
-              <m:r>
-                <m:rPr>
-                  <m:sty m:val="p"/>
-                </m:rPr>
-                <m:t>sin</m:t>
-              </m:r>
-              <m:sSub>
-                <m:e>
-                  <m:r>
-                    <m:t>θ</m:t>
-                  </m:r>
-                </m:e>
-                <m:sub>
-                  <m:r>
-                    <m:t>i</m:t>
-                  </m:r>
-                </m:sub>
-              </m:sSub>
-            </m:e>
-            <m:e>
-              <m:r>
-                <m:rPr>
-                  <m:sty m:val="p"/>
-                </m:rPr>
-                <m:t>cos</m:t>
-              </m:r>
-              <m:sSub>
-                <m:e>
-                  <m:r>
-                    <m:t>θ</m:t>
-                  </m:r>
-                </m:e>
-                <m:sub>
-                  <m:r>
-                    <m:t>i</m:t>
-                  </m:r>
-                </m:sub>
-              </m:sSub>
-              <m:r>
-                <m:rPr>
-                  <m:sty m:val="p"/>
-                </m:rPr>
-                <m:t>cos</m:t>
-              </m:r>
-              <m:sSub>
-                <m:e>
-                  <m:r>
-                    <m:t>α</m:t>
-                  </m:r>
-                </m:e>
-                <m:sub>
-                  <m:r>
-                    <m:t>i</m:t>
-                  </m:r>
-                </m:sub>
-              </m:sSub>
-            </m:e>
-            <m:e>
-              <m:r>
-                <m:t>−</m:t>
-              </m:r>
-              <m:r>
-                <m:rPr>
-                  <m:sty m:val="p"/>
-                </m:rPr>
-                <m:t>cos</m:t>
-              </m:r>
-              <m:sSub>
-                <m:e>
-                  <m:r>
-                    <m:t>θ</m:t>
-                  </m:r>
-                </m:e>
-                <m:sub>
-                  <m:r>
-                    <m:t>i</m:t>
-                  </m:r>
-                </m:sub>
-              </m:sSub>
-              <m:r>
-                <m:rPr>
-                  <m:sty m:val="p"/>
-                </m:rPr>
-                <m:t>sin</m:t>
-              </m:r>
-              <m:sSub>
-                <m:e>
-                  <m:r>
-                    <m:t>α</m:t>
-                  </m:r>
-                </m:e>
-                <m:sub>
-                  <m:r>
-                    <m:t>i</m:t>
-                  </m:r>
-                </m:sub>
-              </m:sSub>
-            </m:e>
-            <m:e>
-              <m:sSub>
-                <m:e>
-                  <m:r>
-                    <m:t>a</m:t>
-                  </m:r>
-                </m:e>
-                <m:sub>
-                  <m:r>
-                    <m:t>i</m:t>
-                  </m:r>
-                </m:sub>
-              </m:sSub>
-              <m:r>
-                <m:rPr>
-                  <m:sty m:val="p"/>
-                </m:rPr>
-                <m:t>sin</m:t>
-              </m:r>
-              <m:sSub>
-                <m:e>
-                  <m:r>
-                    <m:t>θ</m:t>
-                  </m:r>
-                </m:e>
-                <m:sub>
-                  <m:r>
-                    <m:t>i</m:t>
-                  </m:r>
-                </m:sub>
-              </m:sSub>
-            </m:e>
-          </m:mr>
-          <m:mr>
-            <m:e>
-              <m:r>
-                <m:t>0</m:t>
-              </m:r>
-            </m:e>
-            <m:e>
-              <m:r>
-                <m:rPr>
-                  <m:sty m:val="p"/>
-                </m:rPr>
-                <m:t>sin</m:t>
-              </m:r>
-              <m:sSub>
-                <m:e>
-                  <m:r>
-                    <m:t>α</m:t>
-                  </m:r>
-                </m:e>
-                <m:sub>
-                  <m:r>
-                    <m:t>i</m:t>
-                  </m:r>
-                </m:sub>
-              </m:sSub>
-            </m:e>
-            <m:e>
-              <m:r>
-                <m:rPr>
-                  <m:sty m:val="p"/>
-                </m:rPr>
-                <m:t>cos</m:t>
-              </m:r>
-              <m:sSub>
-                <m:e>
-                  <m:r>
-                    <m:t>α</m:t>
-                  </m:r>
-                </m:e>
-                <m:sub>
-                  <m:r>
-                    <m:t>i</m:t>
-                  </m:r>
-                </m:sub>
-              </m:sSub>
-            </m:e>
-            <m:e>
-              <m:sSub>
-                <m:e>
-                  <m:r>
-                    <m:t>d</m:t>
-                  </m:r>
-                </m:e>
-                <m:sub>
-                  <m:r>
-                    <m:t>i</m:t>
-                  </m:r>
-                </m:sub>
-              </m:sSub>
-            </m:e>
-          </m:mr>
-          <m:mr>
-            <m:e>
-              <m:r>
-                <m:t>0</m:t>
-              </m:r>
-            </m:e>
-            <m:e>
-              <m:r>
-                <m:t>0</m:t>
-              </m:r>
-            </m:e>
-            <m:e>
-              <m:r>
-                <m:t>0</m:t>
-              </m:r>
-            </m:e>
-            <m:e>
-              <m:r>
-                <m:t>1</m:t>
-              </m:r>
-            </m:e>
-          </m:mr>
-        </m:m>
-        <m:r>
-          <m:t>]</m:t>
-        </m:r>
-      </m:oMath>
-      <w:r>
-        <w:tab/>
-        <w:t>(2)</w:t>
-      </w:r>
-    </w:p>
-    <w:p>
-      <w:pPr>
-        <w:pStyle w:val="IJTechText"/>
-        <w:ind w:firstLine="283"/>
-      </w:pPr>
-      <w:r>
-        <w:t>Persamaan (2) di atas digunakan untuk menghitung posisi ujung lengan dalam kerangka koordinat basis. Untuk lintasan pengelasan, diperlukan perencanaan jalur dalam ruang kerja yang menghasilkan trayektori posisi dan orientasi yang halus.</w:t>
-      </w:r>
-    </w:p>
-    <w:p>
-      <w:pPr>
-        <w:pStyle w:val="IJTechText"/>
-        <w:ind w:firstLine="283"/>
-      </w:pPr>
-      <w:r>
-        <w:t>Metode penalaan Ziegler-Nichols kedua (closed-loop) dilakukan dengan mengatur K_i=0. K_d=0 lalu meningkatkan K_p hingga sistem berosilasi pada batas kestabilan, menghasilkan gain ultimat K_u dan periode ultimat T_u. Parameter PID kemudian ditentukan berdasarkan tabel Ziegler-Nichols klasik. Meskipun sederhana, metode ini memberikan parameter awal yang cukup baik untuk kebanyakan proses industri (Ogata, 2010).</w:t>
+        <w:t>Termodinamika TRC berakar pada hukum Planck dan prinsip keseimbangan terperinci (detailed balance). Saat sel berada pada suhu T_cell dan menghadap ke langit pada T_sky, sel tersebut memancarkan lebih banyak foton daripada yang diserapnya [19]. Defisit foton ini menciptakan kekosongan hole-elektron yang, jika diekstraksi melalui sirkuit eksternal, menghasilkan arus listrik. Ini adalah kebalikan persis dari efek fotovoltaik, di mana penyerapan foton menciptakan pasangan elektron-hole.</w:t>
       </w:r>
     </w:p>
     <w:tbl>
@@ -796,7 +221,7 @@
               <w:rPr>
                 <w:i/>
               </w:rPr>
-              <w:t>[PROMPT UNTUK AI GAMBAR: Diagram blok sistem kendali posisi lengan robot dengan kendali PID. (create an image A block diagram of a closed-loop position control system for a robotic arm welding application. The diagram shows a reference position input (r) entering a summing junction with a minus sign for feedback. The error signal e flows into a PID controller block containing three parallel paths: proportional gain Kp, integral gain Ki with 1/s. derivative gain Kd with s. The output of the PID controller goes into a saturation limiter then into the plant model block representing the industrial robot arm dynamics (transfer function with inertia and friction). The plant output (actual position) is measured by an encoder sensor with a gain block and fed back to the summing junction. The welding torch end-effector is shown as a block after the plant. The diagram includes labeled signals: e(t) error, u(t) control signal, and y(t) output position. Use clean academic style with blue lines, black text, white background. Add small arrowheads on signal lines, and and Use rectangular blocks with rounded corners. Title the diagram 'Sistem Kendali Posisi Loop Tertutup dengan PID'. White background, and and Clean academic paper figure style.)]</w:t>
+              <w:t>[PROMPT UNTUK AI GAMBAR: Perbandingan Spektrum Operasi PV dan TRC. (create an image "A detailed scientific diagram comparing the operational spectra of Photovoltaic (PV) and Thermoradiative (TRC) cells. The X-axis represents Wavelength (nm) from 0 to 15000 nm on a logarithmic scale. The Y-axis represents Spectral Irradiance. The graph shows two main curves: a yellow/orange curve representing the Solar Spectrum (AM1.5G) peaking around 500 nm and tapering off after 2000 nm. with a shaded blue region under it labeled 'PV Absorption Band'. A second curve, in deep purple/magenta, represents the Thermal Emission Spectrum of a TRC cell at 300K, peaking around 10000 nm (10 micrometers), with a shaded red region labeled 'TRC Emission Band'. An inset box in the top right corner shows a simplified energy band diagram with arrows pointing down for PV (photon absorption) and arrows pointing up for TRC (photon emission). The background is pure white. Clean academic paper figure style with crisp vector lines, clear axis labels, and a professional legend.")]</w:t>
             </w:r>
           </w:p>
         </w:tc>
@@ -814,7 +239,7 @@
         <w:t xml:space="preserve">Figure 1. </w:t>
       </w:r>
       <w:r>
-        <w:t>Diagram blok sistem kendali posisi lengan robot dengan kendali PID</w:t>
+        <w:t>Perbandingan Spektrum Operasi PV dan TRC</w:t>
       </w:r>
     </w:p>
     <w:p>
@@ -823,15 +248,51 @@
         <w:ind w:firstLine="283"/>
       </w:pPr>
       <w:r>
-        <w:t>Gambar 1 memperlihatkan diagram blok sistem kendali posisi yang digunakan. Sinyal referensi r berupa posisi sudut sendi yang direncanakan dari lintasan pengelasan. Error e = r - y diumpankan ke pengontrol PID, yang menghasilkan sinyal kontrol u setelah melalui penjenuhan (saturation) untuk membatasi torsi motor. Blok plant terdiri dari dinamika lengan robot termasuk inersia, gesekan, dan kopling antar sendi. Sensor encoder memberikan umpan balik posisi aktual y.</w:t>
-      </w:r>
-    </w:p>
-    <w:p>
-      <w:pPr>
-        <w:pStyle w:val="IJTechHeadingSection"/>
-      </w:pPr>
-      <w:r>
-        <w:t>METODOLOGI</w:t>
+        <w:t>Gambar 1 mengilustrasikan perbedaan mendasar dalam spektrum operasi kedua teknologi ini. PV beroperasi pada spektrum tampak dan inframerah dekat, sementara TRC bergantung pada inframerah tengah hingga jauh. Pemisahan spektral ini adalah kunci; keduanya tidak perlu berebut foton yang sama, memungkinkan integrasi vertikal tanpa filter optik yang kompleks.</w:t>
+      </w:r>
+    </w:p>
+    <w:tbl>
+      <w:tblPr>
+        <w:tblW w:type="auto" w:w="0"/>
+        <w:jc w:val="center"/>
+        <w:tblLook w:firstColumn="1" w:firstRow="1" w:lastColumn="0" w:lastRow="0" w:noHBand="0" w:noVBand="1" w:val="04A0"/>
+      </w:tblPr>
+      <w:tblGrid>
+        <w:gridCol w:w="9746"/>
+      </w:tblGrid>
+      <w:tr>
+        <w:tc>
+          <w:tcPr>
+            <w:tcW w:type="dxa" w:w="9746"/>
+          </w:tcPr>
+          <w:p>
+            <w:pPr>
+              <w:jc w:val="center"/>
+            </w:pPr>
+            <w:r/>
+            <w:r>
+              <w:rPr>
+                <w:i/>
+              </w:rPr>
+              <w:t>[PROMPT UNTUK AI GAMBAR: Diagram Blok Kerangka Teoretis Hibridisasi. (create an image "A conceptual block diagram illustrating the theoretical framework of a Hybrid Solar-Lunar Cell. The diagram is divided into three main horizontal layers: Top Layer (Photovoltaic Absorber), Middle Layer (Thermal Coupling / Phase Change Material). Bottom Layer (Thermoradiative Emitter). Arrows indicate energy flow: downward yellow arrows for Solar Irradiance entering the PV layer, downward wavy red arrows for Waste Heat transferring through the Thermal Coupling layer. upward magenta arrows for Infrared Emission leaving the TRC layer towards the Cold Sky. On the right side, a mathematical block shows the coupling equations linking PV efficiency to TRC thermal input. The visual style is minimalist, using a white background, soft pastel colors for the layers (light blue for PV, orange for PCM, dark grey for TRC). crisp black text for labels, and clean academic paper figure style.")]</w:t>
+            </w:r>
+          </w:p>
+        </w:tc>
+      </w:tr>
+    </w:tbl>
+    <w:p>
+      <w:pPr>
+        <w:pStyle w:val="IJTechText"/>
+        <w:jc w:val="center"/>
+      </w:pPr>
+      <w:r>
+        <w:rPr>
+          <w:b/>
+        </w:rPr>
+        <w:t xml:space="preserve">Figure 2. </w:t>
+      </w:r>
+      <w:r>
+        <w:t>Diagram Blok Kerangka Teoretis Hibridisasi</w:t>
       </w:r>
     </w:p>
     <w:p>
@@ -840,15 +301,15 @@
         <w:ind w:firstLine="283"/>
       </w:pPr>
       <w:r>
-        <w:t>Bab ini menjelaskan langkah-langkah perancangan sistem kendali PID pada lengan robot industri untuk pengelasan. Metode mencakup pemodelan kinematik, penentuan parameter PID, serta prosedur simulasi.</w:t>
-      </w:r>
-    </w:p>
-    <w:p>
-      <w:pPr>
-        <w:pStyle w:val="IJTechSubheading"/>
-      </w:pPr>
-      <w:r>
-        <w:t>Desain dan Arsitektur Sistem</w:t>
+        <w:t>Gambar 2 menunjukkan diagram blok kerangka teoretis hibridisasi. Kopling termal menjadi kunci; panas yang tidak terkonversi oleh PV harus dialirkan ke lapisan TRC tanpa menghambat emisi radiatif ke langit. Tantangan utamanya adalah merancang material yang konduktif secara termal ke bawah, namun transparan secara optik pada panjang gelombang inframerah jauh.</w:t>
+      </w:r>
+    </w:p>
+    <w:p>
+      <w:pPr>
+        <w:pStyle w:val="IJTechHeadingSection"/>
+      </w:pPr>
+      <w:r>
+        <w:t>METODOLOGI</w:t>
       </w:r>
     </w:p>
     <w:p>
@@ -857,7 +318,293 @@
         <w:ind w:firstLine="283"/>
       </w:pPr>
       <w:r>
-        <w:t>Sistem yang dirancang terdiri dari lengan robot 6-DOF dengan konfigurasi sendi rotasi. Parameter Denavit-Hartenberg untuk lengan robot ditetapkan berdasarkan spesifikasi robot industri umum (misal model Fanuc M-710iC). Table 1 menyajikan parameter DH yang digunakan.</w:t>
+        <w:t>Bagian ini merinci arsitektur fisik sel hibrida, prosedur simulasi, dan model matematis yang digunakan untuk mengevaluasi kinerja sistem di bawah kondisi diurnal.</w:t>
+      </w:r>
+    </w:p>
+    <w:p>
+      <w:pPr>
+        <w:pStyle w:val="IJTechSubheading"/>
+      </w:pPr>
+      <w:r>
+        <w:t>Desain dan Arsitektur Sistem</w:t>
+      </w:r>
+    </w:p>
+    <w:p>
+      <w:pPr>
+        <w:pStyle w:val="IJTechText"/>
+        <w:ind w:firstLine="283"/>
+      </w:pPr>
+      <w:r>
+        <w:t>Arsitektur yang kami usulkan terdiri dari tiga lapisan utama: absorber PV di puncak, lapisan kopling termal di tengah, dan emitor TRC di dasar. Lapisan PV menggunakan material celah pita lebar (misalnya, perovskit atau GaAs) untuk memaksimalkan penyerapan foton energi tinggi [20]. Sisa spektrum inframerah, beserta panas yang dihasilkan dari relaksasi termal pembawa muatan, ditransfer ke lapisan bawah. Desain ini memastikan bahwa foton energi rendah yang biasanya hanya memanaskan sel PV kini dimanfaatkan secara produktif.</w:t>
+      </w:r>
+    </w:p>
+    <w:tbl>
+      <w:tblPr>
+        <w:tblW w:type="auto" w:w="0"/>
+        <w:jc w:val="center"/>
+        <w:tblLook w:firstColumn="1" w:firstRow="1" w:lastColumn="0" w:lastRow="0" w:noHBand="0" w:noVBand="1" w:val="04A0"/>
+      </w:tblPr>
+      <w:tblGrid>
+        <w:gridCol w:w="9746"/>
+      </w:tblGrid>
+      <w:tr>
+        <w:tc>
+          <w:tcPr>
+            <w:tcW w:type="dxa" w:w="9746"/>
+          </w:tcPr>
+          <w:p>
+            <w:pPr>
+              <w:jc w:val="center"/>
+            </w:pPr>
+            <w:r/>
+            <w:r>
+              <w:rPr>
+                <w:i/>
+              </w:rPr>
+              <w:t>[PROMPT UNTUK AI GAMBAR: Alur Data dan Energi Sistem Hibrida. (create an image "A complete flowchart detailing the data and energy flow within the Hybrid Solar-Lunar system. The flowchart starts with a 'Solar Irradiance' node branching into 'PV Absorption' and 'Thermalization'. 'PV Absorption' leads to 'Electrical Output (Day)' and 'Waste Heat'. 'Waste Heat' merges with 'Thermalization' into a 'Phase Change Material (PCM) Storage' node. The PCM node has two outgoing paths: one for 'Daytime Thermal Buffering' and one for 'Nighttime Heat Release'. The nighttime path connects to the 'TRC Emitter' node, which outputs 'Electrical Output (Night)' and 'Radiative Cooling to Sky'. A feedback loop labeled 'Thermal Resistance Control' connects the TRC Emitter back to the PCM. The diagram uses standard flowchart shapes (rectangles for processes, diamonds for decisions like 'Day or Night?'), connected by directional arrows. White background, clean academic paper figure style, high contrast black lines and dark blue text.")]</w:t>
+            </w:r>
+          </w:p>
+        </w:tc>
+      </w:tr>
+    </w:tbl>
+    <w:p>
+      <w:pPr>
+        <w:pStyle w:val="IJTechText"/>
+        <w:jc w:val="center"/>
+      </w:pPr>
+      <w:r>
+        <w:rPr>
+          <w:b/>
+        </w:rPr>
+        <w:t xml:space="preserve">Figure 3. </w:t>
+      </w:r>
+      <w:r>
+        <w:t>Alur Data dan Energi Sistem Hibrida</w:t>
+      </w:r>
+    </w:p>
+    <w:p>
+      <w:pPr>
+        <w:pStyle w:val="IJTechText"/>
+        <w:ind w:firstLine="283"/>
+      </w:pPr>
+      <w:r>
+        <w:t>Gambar 3 merinci alur data dan energi dalam sistem ini. Logika kontrol termal pasif memastikan bahwa energi tidak terbuang sia-sia selama transisi senja dan fajar.</w:t>
+      </w:r>
+    </w:p>
+    <w:tbl>
+      <w:tblPr>
+        <w:tblW w:type="auto" w:w="0"/>
+        <w:jc w:val="center"/>
+        <w:tblLook w:firstColumn="1" w:firstRow="1" w:lastColumn="0" w:lastRow="0" w:noHBand="0" w:noVBand="1" w:val="04A0"/>
+      </w:tblPr>
+      <w:tblGrid>
+        <w:gridCol w:w="9746"/>
+      </w:tblGrid>
+      <w:tr>
+        <w:tc>
+          <w:tcPr>
+            <w:tcW w:type="dxa" w:w="9746"/>
+          </w:tcPr>
+          <w:p>
+            <w:pPr>
+              <w:jc w:val="center"/>
+            </w:pPr>
+            <w:r/>
+            <w:r>
+              <w:rPr>
+                <w:i/>
+              </w:rPr>
+              <w:t>[PROMPT UNTUK AI GAMBAR: Penampang Melintang Arsitektur Lapisan. (create an image "A detailed 3D isometric cross-section diagram of the Hybrid Solar-Lunar Cell layers. From top to bottom: 1) Anti-reflective coating (thin transparent layer). 2) PV Active Layer (textured blue perovskite/GaAs layer with metallic grid electrodes on top), 3) Thermal Coupling Layer (translucent orange layer showing embedded micro-capsules representing Phase Change Material), 4) TRC Active Layer (dark grey InAs/HgCdTe layer with bottom electrodes), 5) Substrate and Heat Sink. On the left side, a temperature gradient scale bar shows hot (red) at the PV layer and cold (blue) at the bottom during daytime, reversing slightly at night. Dimension lines indicate approximate nanometer/micrometer thicknesses for each layer. White background, clean academic paper figure style, realistic material textures but simplified for clarity.")]</w:t>
+            </w:r>
+          </w:p>
+        </w:tc>
+      </w:tr>
+    </w:tbl>
+    <w:p>
+      <w:pPr>
+        <w:pStyle w:val="IJTechText"/>
+        <w:jc w:val="center"/>
+      </w:pPr>
+      <w:r>
+        <w:rPr>
+          <w:b/>
+        </w:rPr>
+        <w:t xml:space="preserve">Figure 4. </w:t>
+      </w:r>
+      <w:r>
+        <w:t>Penampang Melintang Arsitektur Lapisan</w:t>
+      </w:r>
+    </w:p>
+    <w:p>
+      <w:pPr>
+        <w:pStyle w:val="IJTechText"/>
+        <w:ind w:firstLine="283"/>
+      </w:pPr>
+      <w:r>
+        <w:t>Gambar 4 menunjukkan penampang melintang arsitektur lapisan ini. Ketebalan setiap lapisan dioptimalkan untuk menyeimbangkan penyerapan optik dan konduktivitas termal.</w:t>
+      </w:r>
+    </w:p>
+    <w:tbl>
+      <w:tblPr>
+        <w:tblW w:type="auto" w:w="0"/>
+        <w:jc w:val="center"/>
+        <w:tblLook w:firstColumn="1" w:firstRow="1" w:lastColumn="0" w:lastRow="0" w:noHBand="0" w:noVBand="1" w:val="04A0"/>
+      </w:tblPr>
+      <w:tblGrid>
+        <w:gridCol w:w="9746"/>
+      </w:tblGrid>
+      <w:tr>
+        <w:tc>
+          <w:tcPr>
+            <w:tcW w:type="dxa" w:w="9746"/>
+          </w:tcPr>
+          <w:p>
+            <w:pPr>
+              <w:jc w:val="center"/>
+            </w:pPr>
+            <w:r/>
+            <w:r>
+              <w:rPr>
+                <w:i/>
+              </w:rPr>
+              <w:t>[PROMPT UNTUK AI GAMBAR: Sirkuit Termal Ekuivalen. (create an image "An electrical-thermal equivalent circuit diagram representing the heat flow in the Hybrid Cell. The circuit includes a current source representing 'Solar Heat Input (Q_sun)'. This connects to a parallel RC network where the resistor is 'PV Thermal Resistance (R_pv)' and the capacitor is 'PV Heat Capacity (C_pv)'. The node then connects through a series resistor 'Interface Thermal Resistance (R_th)' to a second parallel RC network representing the 'PCM Layer (R_pcm, C_pcm)'. Finally, it connects to the 'TRC Layer' and terminates in a dependent current source representing 'Radiative Heat Loss to Sky (Q_rad)' and a voltage source for 'Ambient Temperature (T_amb)'. Nodes are labeled with temperatures T1, T2, T3. Standard electronic schematic symbols are used for resistors (zigzag) and capacitors (parallel lines). White background, clean academic paper figure style, black lines and text.")]</w:t>
+            </w:r>
+          </w:p>
+        </w:tc>
+      </w:tr>
+    </w:tbl>
+    <w:p>
+      <w:pPr>
+        <w:pStyle w:val="IJTechText"/>
+        <w:jc w:val="center"/>
+      </w:pPr>
+      <w:r>
+        <w:rPr>
+          <w:b/>
+        </w:rPr>
+        <w:t xml:space="preserve">Figure 5. </w:t>
+      </w:r>
+      <w:r>
+        <w:t>Sirkuit Termal Ekuivalen</w:t>
+      </w:r>
+    </w:p>
+    <w:p>
+      <w:pPr>
+        <w:pStyle w:val="IJTechText"/>
+        <w:ind w:firstLine="283"/>
+      </w:pPr>
+      <w:r>
+        <w:t>Gambar 5 memetakan sirkuit termal ekuivalen, di mana resistansi termal antarmuka (R_th) menjadi variabel kritis yang harus diminimalkan. Kapasitansi termal dari lapisan PCM bertindak sebagai penyangga, meratakan fluktuasi suhu yang ekstrem.</w:t>
+      </w:r>
+    </w:p>
+    <w:p>
+      <w:pPr>
+        <w:pStyle w:val="IJTechSubheading"/>
+      </w:pPr>
+      <w:r>
+        <w:t>Implementasi dan Prosedur Eksperimen</w:t>
+      </w:r>
+    </w:p>
+    <w:p>
+      <w:pPr>
+        <w:pStyle w:val="IJTechText"/>
+        <w:ind w:firstLine="283"/>
+      </w:pPr>
+      <w:r>
+        <w:t>Pemodelan matematis dimulai dengan persamaan daya PV. Daya yang dihasilkan bergantung pada fluks foton matahari dan efisiensi kuantum eksternal material.</w:t>
+      </w:r>
+    </w:p>
+    <w:p>
+      <w:pPr>
+        <w:pStyle w:val="IJTechText"/>
+        <w:jc w:val="center"/>
+      </w:pPr>
+      <w:r>
+        <w:rPr>
+          <w:i/>
+        </w:rPr>
+        <w:t>PPV = ∫λminλg (hc)/(λ) Φsun(λ) ηEQE(λ) dλ</w:t>
+      </w:r>
+      <w:r>
+        <w:tab/>
+        <w:t>(1)</w:t>
+      </w:r>
+    </w:p>
+    <w:p>
+      <w:pPr>
+        <w:pStyle w:val="IJTechText"/>
+        <w:ind w:firstLine="283"/>
+      </w:pPr>
+      <w:r>
+        <w:t>Persamaan (1) mendefinisikan P_PV sebagai integral dari fluks spektral matahari Φ_sun dikalikan energi foton dan efisiensi η_EQE, di atas batas celah pita E_g. Variabel h dan c masing-masing adalah konstanta Planck dan kecepatan cahaya.</w:t>
+      </w:r>
+    </w:p>
+    <w:p>
+      <w:pPr>
+        <w:pStyle w:val="IJTechText"/>
+        <w:ind w:firstLine="283"/>
+      </w:pPr>
+      <w:r>
+        <w:t>Untuk mode malam, daya termoradiatif dihitung menggunakan perbedaan laju emisi dan absorpsi foton inframerah.</w:t>
+      </w:r>
+    </w:p>
+    <w:p>
+      <w:pPr>
+        <w:pStyle w:val="IJTechText"/>
+        <w:jc w:val="center"/>
+      </w:pPr>
+      <w:r>
+        <w:rPr>
+          <w:i/>
+        </w:rPr>
+        <w:t>PTRC = ∫₀∞ (2π hc²)/(λ⁵) ( (1)/(ehcλ k_B) Tcell - 1 - (1)/(ehcλ k_B) Tsky - 1 ) dλ</w:t>
+      </w:r>
+      <w:r>
+        <w:tab/>
+        <w:t>(2)</w:t>
+      </w:r>
+    </w:p>
+    <w:p>
+      <w:pPr>
+        <w:pStyle w:val="IJTechText"/>
+        <w:ind w:firstLine="283"/>
+      </w:pPr>
+      <w:r>
+        <w:t>Pada Persamaan (2), P_TRC sangat sensitif terhadap perbedaan suhu sel (T_cell) dan suhu langit (T_sky). Konstanta k_B adalah konstanta Boltzmann. Integral ini menangkap keseimbangan terperinci antara foton yang dipancarkan sel dan foton latar belakang yang diserapnya.</w:t>
+      </w:r>
+    </w:p>
+    <w:p>
+      <w:pPr>
+        <w:pStyle w:val="IJTechText"/>
+        <w:ind w:firstLine="283"/>
+      </w:pPr>
+      <w:r>
+        <w:t>Efisiensi total sistem hibrida dievaluasi berdasarkan energi harian total yang dihasilkan.</w:t>
+      </w:r>
+    </w:p>
+    <w:p>
+      <w:pPr>
+        <w:pStyle w:val="IJTechText"/>
+        <w:jc w:val="center"/>
+      </w:pPr>
+      <w:r>
+        <w:rPr>
+          <w:i/>
+        </w:rPr>
+        <w:t>ηhybrid = (∫₀tday PPV(t) dt + ∫tday24h PTRC(t) dt)/(Gsolar · tday + σ (Tamb⁴ - Tsky⁴) · tnight)</w:t>
+      </w:r>
+      <w:r>
+        <w:tab/>
+        <w:t>(3)</w:t>
+      </w:r>
+    </w:p>
+    <w:p>
+      <w:pPr>
+        <w:pStyle w:val="IJTechText"/>
+        <w:ind w:firstLine="283"/>
+      </w:pPr>
+      <w:r>
+        <w:t>Persamaan (3) menjumlahkan integral daya siang dan malam, dinormalisasi terhadap total input energi radiatif dari matahari dan gradien termal langit. Parameter simulasi dan batas variabel dirangkum dalam Table 1.</w:t>
       </w:r>
     </w:p>
     <w:p>
@@ -872,7 +619,7 @@
         <w:t>Table 1</w:t>
       </w:r>
       <w:r>
-        <w:t>. Parameter Denavit-Hartenberg Lengan Robot 6-DOF</w:t>
+        <w:t>. Parameter dan Variabel Simulasi Sistem</w:t>
       </w:r>
     </w:p>
     <w:tbl>
@@ -890,16 +637,14 @@
         </w:tblBorders>
       </w:tblPr>
       <w:tblGrid>
-        <w:gridCol w:w="1949"/>
-        <w:gridCol w:w="1949"/>
-        <w:gridCol w:w="1949"/>
-        <w:gridCol w:w="1949"/>
-        <w:gridCol w:w="1949"/>
+        <w:gridCol w:w="3249"/>
+        <w:gridCol w:w="3249"/>
+        <w:gridCol w:w="3249"/>
       </w:tblGrid>
       <w:tr>
         <w:tc>
           <w:tcPr>
-            <w:tcW w:type="dxa" w:w="1949"/>
+            <w:tcW w:type="dxa" w:w="3249"/>
           </w:tcPr>
           <w:p>
             <w:pPr>
@@ -910,13 +655,13 @@
               <w:rPr>
                 <w:b/>
               </w:rPr>
-              <w:t>Sendi</w:t>
-            </w:r>
-          </w:p>
-        </w:tc>
-        <w:tc>
-          <w:tcPr>
-            <w:tcW w:type="dxa" w:w="1949"/>
+              <w:t>Parameter</w:t>
+            </w:r>
+          </w:p>
+        </w:tc>
+        <w:tc>
+          <w:tcPr>
+            <w:tcW w:type="dxa" w:w="3249"/>
           </w:tcPr>
           <w:p>
             <w:pPr>
@@ -927,13 +672,13 @@
               <w:rPr>
                 <w:b/>
               </w:rPr>
-              <w:t>\iθ_i (rad)\i</w:t>
-            </w:r>
-          </w:p>
-        </w:tc>
-        <w:tc>
-          <w:tcPr>
-            <w:tcW w:type="dxa" w:w="1949"/>
+              <w:t>Simbol</w:t>
+            </w:r>
+          </w:p>
+        </w:tc>
+        <w:tc>
+          <w:tcPr>
+            <w:tcW w:type="dxa" w:w="3249"/>
           </w:tcPr>
           <w:p>
             <w:pPr>
@@ -944,41 +689,7 @@
               <w:rPr>
                 <w:b/>
               </w:rPr>
-              <w:t>\id_i (mm)\i</w:t>
-            </w:r>
-          </w:p>
-        </w:tc>
-        <w:tc>
-          <w:tcPr>
-            <w:tcW w:type="dxa" w:w="1949"/>
-          </w:tcPr>
-          <w:p>
-            <w:pPr>
-              <w:jc w:val="center"/>
-            </w:pPr>
-            <w:r/>
-            <w:r>
-              <w:rPr>
-                <w:b/>
-              </w:rPr>
-              <w:t>\ia_i (mm)\i</w:t>
-            </w:r>
-          </w:p>
-        </w:tc>
-        <w:tc>
-          <w:tcPr>
-            <w:tcW w:type="dxa" w:w="1949"/>
-          </w:tcPr>
-          <w:p>
-            <w:pPr>
-              <w:jc w:val="center"/>
-            </w:pPr>
-            <w:r/>
-            <w:r>
-              <w:rPr>
-                <w:b/>
-              </w:rPr>
-              <w:t>\iα_i (rad)\i</w:t>
+              <w:t>Nilai / Kondisi</w:t>
             </w:r>
           </w:p>
         </w:tc>
@@ -986,71 +697,43 @@
       <w:tr>
         <w:tc>
           <w:tcPr>
-            <w:tcW w:type="dxa" w:w="1949"/>
-          </w:tcPr>
-          <w:p>
-            <w:pPr>
-              <w:jc w:val="center"/>
-            </w:pPr>
-            <w:r/>
-            <w:r>
-              <w:t>1</w:t>
-            </w:r>
-          </w:p>
-        </w:tc>
-        <w:tc>
-          <w:tcPr>
-            <w:tcW w:type="dxa" w:w="1949"/>
-          </w:tcPr>
-          <w:p>
-            <w:pPr>
-              <w:jc w:val="center"/>
-            </w:pPr>
-            <w:r/>
-            <w:r>
-              <w:t>q1</w:t>
-            </w:r>
-          </w:p>
-        </w:tc>
-        <w:tc>
-          <w:tcPr>
-            <w:tcW w:type="dxa" w:w="1949"/>
-          </w:tcPr>
-          <w:p>
-            <w:pPr>
-              <w:jc w:val="center"/>
-            </w:pPr>
-            <w:r/>
-            <w:r>
-              <w:t>a1</w:t>
-            </w:r>
-          </w:p>
-        </w:tc>
-        <w:tc>
-          <w:tcPr>
-            <w:tcW w:type="dxa" w:w="1949"/>
-          </w:tcPr>
-          <w:p>
-            <w:pPr>
-              <w:jc w:val="center"/>
-            </w:pPr>
-            <w:r/>
-            <w:r>
-              <w:t>a2</w:t>
-            </w:r>
-          </w:p>
-        </w:tc>
-        <w:tc>
-          <w:tcPr>
-            <w:tcW w:type="dxa" w:w="1949"/>
-          </w:tcPr>
-          <w:p>
-            <w:pPr>
-              <w:jc w:val="center"/>
-            </w:pPr>
-            <w:r/>
-            <w:r>
-              <w:t>π/2</w:t>
+            <w:tcW w:type="dxa" w:w="3249"/>
+          </w:tcPr>
+          <w:p>
+            <w:pPr>
+              <w:jc w:val="center"/>
+            </w:pPr>
+            <w:r/>
+            <w:r>
+              <w:t>Irradiansi Matahari Puncak</w:t>
+            </w:r>
+          </w:p>
+        </w:tc>
+        <w:tc>
+          <w:tcPr>
+            <w:tcW w:type="dxa" w:w="3249"/>
+          </w:tcPr>
+          <w:p>
+            <w:pPr>
+              <w:jc w:val="center"/>
+            </w:pPr>
+            <w:r/>
+            <w:r>
+              <w:t>$G_{solar}$</w:t>
+            </w:r>
+          </w:p>
+        </w:tc>
+        <w:tc>
+          <w:tcPr>
+            <w:tcW w:type="dxa" w:w="3249"/>
+          </w:tcPr>
+          <w:p>
+            <w:pPr>
+              <w:jc w:val="center"/>
+            </w:pPr>
+            <w:r/>
+            <w:r>
+              <w:t>x</w:t>
             </w:r>
           </w:p>
         </w:tc>
@@ -1058,71 +741,43 @@
       <w:tr>
         <w:tc>
           <w:tcPr>
-            <w:tcW w:type="dxa" w:w="1949"/>
-          </w:tcPr>
-          <w:p>
-            <w:pPr>
-              <w:jc w:val="center"/>
-            </w:pPr>
-            <w:r/>
-            <w:r>
-              <w:t>2</w:t>
-            </w:r>
-          </w:p>
-        </w:tc>
-        <w:tc>
-          <w:tcPr>
-            <w:tcW w:type="dxa" w:w="1949"/>
-          </w:tcPr>
-          <w:p>
-            <w:pPr>
-              <w:jc w:val="center"/>
-            </w:pPr>
-            <w:r/>
-            <w:r>
-              <w:t>q2</w:t>
-            </w:r>
-          </w:p>
-        </w:tc>
-        <w:tc>
-          <w:tcPr>
-            <w:tcW w:type="dxa" w:w="1949"/>
-          </w:tcPr>
-          <w:p>
-            <w:pPr>
-              <w:jc w:val="center"/>
-            </w:pPr>
-            <w:r/>
-            <w:r>
-              <w:t>0</w:t>
-            </w:r>
-          </w:p>
-        </w:tc>
-        <w:tc>
-          <w:tcPr>
-            <w:tcW w:type="dxa" w:w="1949"/>
-          </w:tcPr>
-          <w:p>
-            <w:pPr>
-              <w:jc w:val="center"/>
-            </w:pPr>
-            <w:r/>
-            <w:r>
-              <w:t>a3</w:t>
-            </w:r>
-          </w:p>
-        </w:tc>
-        <w:tc>
-          <w:tcPr>
-            <w:tcW w:type="dxa" w:w="1949"/>
-          </w:tcPr>
-          <w:p>
-            <w:pPr>
-              <w:jc w:val="center"/>
-            </w:pPr>
-            <w:r/>
-            <w:r>
-              <w:t>0</w:t>
+            <w:tcW w:type="dxa" w:w="3249"/>
+          </w:tcPr>
+          <w:p>
+            <w:pPr>
+              <w:jc w:val="center"/>
+            </w:pPr>
+            <w:r/>
+            <w:r>
+              <w:t>Suhu Langit Malam Efektif</w:t>
+            </w:r>
+          </w:p>
+        </w:tc>
+        <w:tc>
+          <w:tcPr>
+            <w:tcW w:type="dxa" w:w="3249"/>
+          </w:tcPr>
+          <w:p>
+            <w:pPr>
+              <w:jc w:val="center"/>
+            </w:pPr>
+            <w:r/>
+            <w:r>
+              <w:t>$T_{sky}$</w:t>
+            </w:r>
+          </w:p>
+        </w:tc>
+        <w:tc>
+          <w:tcPr>
+            <w:tcW w:type="dxa" w:w="3249"/>
+          </w:tcPr>
+          <w:p>
+            <w:pPr>
+              <w:jc w:val="center"/>
+            </w:pPr>
+            <w:r/>
+            <w:r>
+              <w:t>x</w:t>
             </w:r>
           </w:p>
         </w:tc>
@@ -1130,71 +785,43 @@
       <w:tr>
         <w:tc>
           <w:tcPr>
-            <w:tcW w:type="dxa" w:w="1949"/>
-          </w:tcPr>
-          <w:p>
-            <w:pPr>
-              <w:jc w:val="center"/>
-            </w:pPr>
-            <w:r/>
-            <w:r>
-              <w:t>3</w:t>
-            </w:r>
-          </w:p>
-        </w:tc>
-        <w:tc>
-          <w:tcPr>
-            <w:tcW w:type="dxa" w:w="1949"/>
-          </w:tcPr>
-          <w:p>
-            <w:pPr>
-              <w:jc w:val="center"/>
-            </w:pPr>
-            <w:r/>
-            <w:r>
-              <w:t>q3</w:t>
-            </w:r>
-          </w:p>
-        </w:tc>
-        <w:tc>
-          <w:tcPr>
-            <w:tcW w:type="dxa" w:w="1949"/>
-          </w:tcPr>
-          <w:p>
-            <w:pPr>
-              <w:jc w:val="center"/>
-            </w:pPr>
-            <w:r/>
-            <w:r>
-              <w:t>0</w:t>
-            </w:r>
-          </w:p>
-        </w:tc>
-        <w:tc>
-          <w:tcPr>
-            <w:tcW w:type="dxa" w:w="1949"/>
-          </w:tcPr>
-          <w:p>
-            <w:pPr>
-              <w:jc w:val="center"/>
-            </w:pPr>
-            <w:r/>
-            <w:r>
-              <w:t>a4</w:t>
-            </w:r>
-          </w:p>
-        </w:tc>
-        <w:tc>
-          <w:tcPr>
-            <w:tcW w:type="dxa" w:w="1949"/>
-          </w:tcPr>
-          <w:p>
-            <w:pPr>
-              <w:jc w:val="center"/>
-            </w:pPr>
-            <w:r/>
-            <w:r>
-              <w:t>0</w:t>
+            <w:tcW w:type="dxa" w:w="3249"/>
+          </w:tcPr>
+          <w:p>
+            <w:pPr>
+              <w:jc w:val="center"/>
+            </w:pPr>
+            <w:r/>
+            <w:r>
+              <w:t>Suhu Ambien Siang/Malam</w:t>
+            </w:r>
+          </w:p>
+        </w:tc>
+        <w:tc>
+          <w:tcPr>
+            <w:tcW w:type="dxa" w:w="3249"/>
+          </w:tcPr>
+          <w:p>
+            <w:pPr>
+              <w:jc w:val="center"/>
+            </w:pPr>
+            <w:r/>
+            <w:r>
+              <w:t>$T_{amb}$</w:t>
+            </w:r>
+          </w:p>
+        </w:tc>
+        <w:tc>
+          <w:tcPr>
+            <w:tcW w:type="dxa" w:w="3249"/>
+          </w:tcPr>
+          <w:p>
+            <w:pPr>
+              <w:jc w:val="center"/>
+            </w:pPr>
+            <w:r/>
+            <w:r>
+              <w:t>x</w:t>
             </w:r>
           </w:p>
         </w:tc>
@@ -1202,71 +829,43 @@
       <w:tr>
         <w:tc>
           <w:tcPr>
-            <w:tcW w:type="dxa" w:w="1949"/>
-          </w:tcPr>
-          <w:p>
-            <w:pPr>
-              <w:jc w:val="center"/>
-            </w:pPr>
-            <w:r/>
-            <w:r>
-              <w:t>4</w:t>
-            </w:r>
-          </w:p>
-        </w:tc>
-        <w:tc>
-          <w:tcPr>
-            <w:tcW w:type="dxa" w:w="1949"/>
-          </w:tcPr>
-          <w:p>
-            <w:pPr>
-              <w:jc w:val="center"/>
-            </w:pPr>
-            <w:r/>
-            <w:r>
-              <w:t>q4</w:t>
-            </w:r>
-          </w:p>
-        </w:tc>
-        <w:tc>
-          <w:tcPr>
-            <w:tcW w:type="dxa" w:w="1949"/>
-          </w:tcPr>
-          <w:p>
-            <w:pPr>
-              <w:jc w:val="center"/>
-            </w:pPr>
-            <w:r/>
-            <w:r>
-              <w:t>a5</w:t>
-            </w:r>
-          </w:p>
-        </w:tc>
-        <w:tc>
-          <w:tcPr>
-            <w:tcW w:type="dxa" w:w="1949"/>
-          </w:tcPr>
-          <w:p>
-            <w:pPr>
-              <w:jc w:val="center"/>
-            </w:pPr>
-            <w:r/>
-            <w:r>
-              <w:t>0</w:t>
-            </w:r>
-          </w:p>
-        </w:tc>
-        <w:tc>
-          <w:tcPr>
-            <w:tcW w:type="dxa" w:w="1949"/>
-          </w:tcPr>
-          <w:p>
-            <w:pPr>
-              <w:jc w:val="center"/>
-            </w:pPr>
-            <w:r/>
-            <w:r>
-              <w:t>-π/2</w:t>
+            <w:tcW w:type="dxa" w:w="3249"/>
+          </w:tcPr>
+          <w:p>
+            <w:pPr>
+              <w:jc w:val="center"/>
+            </w:pPr>
+            <w:r/>
+            <w:r>
+              <w:t>Resistansi Termal Antarmuka</w:t>
+            </w:r>
+          </w:p>
+        </w:tc>
+        <w:tc>
+          <w:tcPr>
+            <w:tcW w:type="dxa" w:w="3249"/>
+          </w:tcPr>
+          <w:p>
+            <w:pPr>
+              <w:jc w:val="center"/>
+            </w:pPr>
+            <w:r/>
+            <w:r>
+              <w:t>$R_{th}$</w:t>
+            </w:r>
+          </w:p>
+        </w:tc>
+        <w:tc>
+          <w:tcPr>
+            <w:tcW w:type="dxa" w:w="3249"/>
+          </w:tcPr>
+          <w:p>
+            <w:pPr>
+              <w:jc w:val="center"/>
+            </w:pPr>
+            <w:r/>
+            <w:r>
+              <w:t>x</w:t>
             </w:r>
           </w:p>
         </w:tc>
@@ -1274,71 +873,43 @@
       <w:tr>
         <w:tc>
           <w:tcPr>
-            <w:tcW w:type="dxa" w:w="1949"/>
-          </w:tcPr>
-          <w:p>
-            <w:pPr>
-              <w:jc w:val="center"/>
-            </w:pPr>
-            <w:r/>
-            <w:r>
-              <w:t>5</w:t>
-            </w:r>
-          </w:p>
-        </w:tc>
-        <w:tc>
-          <w:tcPr>
-            <w:tcW w:type="dxa" w:w="1949"/>
-          </w:tcPr>
-          <w:p>
-            <w:pPr>
-              <w:jc w:val="center"/>
-            </w:pPr>
-            <w:r/>
-            <w:r>
-              <w:t>q5</w:t>
-            </w:r>
-          </w:p>
-        </w:tc>
-        <w:tc>
-          <w:tcPr>
-            <w:tcW w:type="dxa" w:w="1949"/>
-          </w:tcPr>
-          <w:p>
-            <w:pPr>
-              <w:jc w:val="center"/>
-            </w:pPr>
-            <w:r/>
-            <w:r>
-              <w:t>0</w:t>
-            </w:r>
-          </w:p>
-        </w:tc>
-        <w:tc>
-          <w:tcPr>
-            <w:tcW w:type="dxa" w:w="1949"/>
-          </w:tcPr>
-          <w:p>
-            <w:pPr>
-              <w:jc w:val="center"/>
-            </w:pPr>
-            <w:r/>
-            <w:r>
-              <w:t>0</w:t>
-            </w:r>
-          </w:p>
-        </w:tc>
-        <w:tc>
-          <w:tcPr>
-            <w:tcW w:type="dxa" w:w="1949"/>
-          </w:tcPr>
-          <w:p>
-            <w:pPr>
-              <w:jc w:val="center"/>
-            </w:pPr>
-            <w:r/>
-            <w:r>
-              <w:t>π/2</w:t>
+            <w:tcW w:type="dxa" w:w="3249"/>
+          </w:tcPr>
+          <w:p>
+            <w:pPr>
+              <w:jc w:val="center"/>
+            </w:pPr>
+            <w:r/>
+            <w:r>
+              <w:t>Kapasitansi Panas PCM</w:t>
+            </w:r>
+          </w:p>
+        </w:tc>
+        <w:tc>
+          <w:tcPr>
+            <w:tcW w:type="dxa" w:w="3249"/>
+          </w:tcPr>
+          <w:p>
+            <w:pPr>
+              <w:jc w:val="center"/>
+            </w:pPr>
+            <w:r/>
+            <w:r>
+              <w:t>$C_{pcm}$</w:t>
+            </w:r>
+          </w:p>
+        </w:tc>
+        <w:tc>
+          <w:tcPr>
+            <w:tcW w:type="dxa" w:w="3249"/>
+          </w:tcPr>
+          <w:p>
+            <w:pPr>
+              <w:jc w:val="center"/>
+            </w:pPr>
+            <w:r/>
+            <w:r>
+              <w:t>x</w:t>
             </w:r>
           </w:p>
         </w:tc>
@@ -1346,71 +917,87 @@
       <w:tr>
         <w:tc>
           <w:tcPr>
-            <w:tcW w:type="dxa" w:w="1949"/>
-          </w:tcPr>
-          <w:p>
-            <w:pPr>
-              <w:jc w:val="center"/>
-            </w:pPr>
-            <w:r/>
-            <w:r>
-              <w:t>6</w:t>
-            </w:r>
-          </w:p>
-        </w:tc>
-        <w:tc>
-          <w:tcPr>
-            <w:tcW w:type="dxa" w:w="1949"/>
-          </w:tcPr>
-          <w:p>
-            <w:pPr>
-              <w:jc w:val="center"/>
-            </w:pPr>
-            <w:r/>
-            <w:r>
-              <w:t>q6</w:t>
-            </w:r>
-          </w:p>
-        </w:tc>
-        <w:tc>
-          <w:tcPr>
-            <w:tcW w:type="dxa" w:w="1949"/>
-          </w:tcPr>
-          <w:p>
-            <w:pPr>
-              <w:jc w:val="center"/>
-            </w:pPr>
-            <w:r/>
-            <w:r>
-              <w:t>a6</w:t>
-            </w:r>
-          </w:p>
-        </w:tc>
-        <w:tc>
-          <w:tcPr>
-            <w:tcW w:type="dxa" w:w="1949"/>
-          </w:tcPr>
-          <w:p>
-            <w:pPr>
-              <w:jc w:val="center"/>
-            </w:pPr>
-            <w:r/>
-            <w:r>
-              <w:t>0</w:t>
-            </w:r>
-          </w:p>
-        </w:tc>
-        <w:tc>
-          <w:tcPr>
-            <w:tcW w:type="dxa" w:w="1949"/>
-          </w:tcPr>
-          <w:p>
-            <w:pPr>
-              <w:jc w:val="center"/>
-            </w:pPr>
-            <w:r/>
-            <w:r>
-              <w:t>0</w:t>
+            <w:tcW w:type="dxa" w:w="3249"/>
+          </w:tcPr>
+          <w:p>
+            <w:pPr>
+              <w:jc w:val="center"/>
+            </w:pPr>
+            <w:r/>
+            <w:r>
+              <w:t>Celah Pita Material PV</w:t>
+            </w:r>
+          </w:p>
+        </w:tc>
+        <w:tc>
+          <w:tcPr>
+            <w:tcW w:type="dxa" w:w="3249"/>
+          </w:tcPr>
+          <w:p>
+            <w:pPr>
+              <w:jc w:val="center"/>
+            </w:pPr>
+            <w:r/>
+            <w:r>
+              <w:t>$E_{g,PV}$</w:t>
+            </w:r>
+          </w:p>
+        </w:tc>
+        <w:tc>
+          <w:tcPr>
+            <w:tcW w:type="dxa" w:w="3249"/>
+          </w:tcPr>
+          <w:p>
+            <w:pPr>
+              <w:jc w:val="center"/>
+            </w:pPr>
+            <w:r/>
+            <w:r>
+              <w:t>x</w:t>
+            </w:r>
+          </w:p>
+        </w:tc>
+      </w:tr>
+      <w:tr>
+        <w:tc>
+          <w:tcPr>
+            <w:tcW w:type="dxa" w:w="3249"/>
+          </w:tcPr>
+          <w:p>
+            <w:pPr>
+              <w:jc w:val="center"/>
+            </w:pPr>
+            <w:r/>
+            <w:r>
+              <w:t>Celah Pita Material TRC</w:t>
+            </w:r>
+          </w:p>
+        </w:tc>
+        <w:tc>
+          <w:tcPr>
+            <w:tcW w:type="dxa" w:w="3249"/>
+          </w:tcPr>
+          <w:p>
+            <w:pPr>
+              <w:jc w:val="center"/>
+            </w:pPr>
+            <w:r/>
+            <w:r>
+              <w:t>$E_{g,TRC}$</w:t>
+            </w:r>
+          </w:p>
+        </w:tc>
+        <w:tc>
+          <w:tcPr>
+            <w:tcW w:type="dxa" w:w="3249"/>
+          </w:tcPr>
+          <w:p>
+            <w:pPr>
+              <w:jc w:val="center"/>
+            </w:pPr>
+            <w:r/>
+            <w:r>
+              <w:t>x</w:t>
             </w:r>
           </w:p>
         </w:tc>
@@ -1422,51 +1009,15 @@
         <w:ind w:firstLine="283"/>
       </w:pPr>
       <w:r>
-        <w:t>Parameter a₁ sampai a₆ merupakan panjang lengan dan offset yang diperoleh dari lembar data robot industri. Sudut sendi q₁ hingga q₆ adalah variabel yang dikendalikan. Matriks transformasi total T₆⁰ dihitung menggunakan perkalian matriks dari Persamaan (2), kemudian digunakan untuk memperoleh posisi ujung lengan dalam kerangka basis.</w:t>
-      </w:r>
-    </w:p>
-    <w:tbl>
-      <w:tblPr>
-        <w:tblW w:type="auto" w:w="0"/>
-        <w:jc w:val="center"/>
-        <w:tblLook w:firstColumn="1" w:firstRow="1" w:lastColumn="0" w:lastRow="0" w:noHBand="0" w:noVBand="1" w:val="04A0"/>
-      </w:tblPr>
-      <w:tblGrid>
-        <w:gridCol w:w="9746"/>
-      </w:tblGrid>
-      <w:tr>
-        <w:tc>
-          <w:tcPr>
-            <w:tcW w:type="dxa" w:w="9746"/>
-          </w:tcPr>
-          <w:p>
-            <w:pPr>
-              <w:jc w:val="center"/>
-            </w:pPr>
-            <w:r/>
-            <w:r>
-              <w:rPr>
-                <w:i/>
-              </w:rPr>
-              <w:t>[PROMPT UNTUK AI GAMBAR: Arsitektur sistem kendali PID pada lengan robot untuk pengelasan komponen otomotif. (create an image A system architecture diagram for a robotic welding cell using PID-controlled manipulator. The diagram has three main sections: (1) Robot Controller - a computer block labeled 'PID Controller' with inputs from a trajectory planner, outputs to servo drives. (2) Welding Equipment - a welding power source connected to a welding torch end-effector mounted on robot flange, with gas supply line and wire feeder; (3) Workpiece - an automotive body panel (door or fender) on a fixture with clamping devices. Signal flow arrows: trajectory reference (position points) from offline programming software to PID controller, feedback from encoder sensors on each robot joint (6 joints indicated with small circles), control signal to motor amplifiers. monitoring signals to PC. Include labels: 'Trajectory Generator', 'PID Control Law', 'Servo Drive', 'Encoder Feedback', 'Welding Torch', 'Workpiece', 'Fixture'. Use clean block diagram style, black and white with blue accents. Add a dashed box around the robot arm showing its 6 joints. White background, and Clean academic paper figure style.)]</w:t>
-            </w:r>
-          </w:p>
-        </w:tc>
-      </w:tr>
-    </w:tbl>
-    <w:p>
-      <w:pPr>
-        <w:pStyle w:val="IJTechText"/>
-        <w:jc w:val="center"/>
-      </w:pPr>
-      <w:r>
-        <w:rPr>
-          <w:b/>
-        </w:rPr>
-        <w:t xml:space="preserve">Figure 2. </w:t>
-      </w:r>
-      <w:r>
-        <w:t>Arsitektur sistem kendali PID pada lengan robot untuk pengelasan komponen otomotif</w:t>
+        <w:t>Table 1 merangkum parameter input untuk simulasi numerik. Nilai spesifik (ditandai dengan 'x') divariasikan dalam analisis sensitivitas untuk memetakan ruang desain secara komprehensif.</w:t>
+      </w:r>
+    </w:p>
+    <w:p>
+      <w:pPr>
+        <w:pStyle w:val="IJTechHeadingSection"/>
+      </w:pPr>
+      <w:r>
+        <w:t>HASIL DAN PEMBAHASAN</w:t>
       </w:r>
     </w:p>
     <w:p>
@@ -1475,23 +1026,7 @@
         <w:ind w:firstLine="283"/>
       </w:pPr>
       <w:r>
-        <w:t>Gambar 2 menunjukkan arsitektur keseluruhan sistem. Trajektori pengelasan dihasilkan oleh perangkat lunak CAM offline, menghasilkan posisi referensi setiap sendi per interval waktu. Pengontrol PID pada masing-masing sendi menghitung sinyal torsi yang diperlukan untuk mencapai posisi tersebut. Umpan balik dari encoder resolusi tinggi memberikan informasi posisi aktual setiap sendi dengan presisi mikrometer.</w:t>
-      </w:r>
-    </w:p>
-    <w:p>
-      <w:pPr>
-        <w:pStyle w:val="IJTechText"/>
-        <w:jc w:val="center"/>
-      </w:pPr>
-      <w:r>
-        <w:rPr>
-          <w:i/>
-        </w:rPr>
-        <w:t>E = mc²</w:t>
-      </w:r>
-      <w:r>
-        <w:tab/>
-        <w:t>(3)</w:t>
+        <w:t>Bagian ini menyajikan hasil simulasi numerik dari model termodinamika yang telah dirumuskan, diikuti dengan analisis mendalam mengenai trade-off efisiensi dan implikasi praktisnya.</w:t>
       </w:r>
     </w:p>
     <w:p>
@@ -1499,7 +1034,7 @@
         <w:pStyle w:val="IJTechSubheading"/>
       </w:pPr>
       <w:r>
-        <w:t>Implementasi dan Prosedur Eksperimen</w:t>
+        <w:t>Hasil Eksperimen</w:t>
       </w:r>
     </w:p>
     <w:p>
@@ -1508,58 +1043,7 @@
         <w:ind w:firstLine="283"/>
       </w:pPr>
       <w:r>
-        <w:t>Simulasi dilakukan menggunakan MATLAB/Simulink R2023a. Pemodelan plant menggunakan fungsi alih orde dua plus waktu tunda untuk merepresentasikan dinamika satu sendi dengan beban elektroda las. Fungsi alih yang digunakan adalah</w:t>
-      </w:r>
-    </w:p>
-    <w:p>
-      <w:pPr>
-        <w:pStyle w:val="IJTechText"/>
-        <w:jc w:val="center"/>
-      </w:pPr>
-      <m:oMath xmlns:mml="http://www.w3.org/1998/Math/MathML">
-        <m:r>
-          <m:t>G(s)=</m:t>
-        </m:r>
-        <m:f>
-          <m:fPr>
-            <m:type m:val="bar"/>
-          </m:fPr>
-          <m:num>
-            <m:r>
-              <m:t>K</m:t>
-            </m:r>
-          </m:num>
-          <m:den>
-            <m:r>
-              <m:t>τs+1</m:t>
-            </m:r>
-          </m:den>
-        </m:f>
-        <m:r>
-          <m:t>e−Ls</m:t>
-        </m:r>
-      </m:oMath>
-      <w:r>
-        <w:tab/>
-        <w:t>(4)</w:t>
-      </w:r>
-    </w:p>
-    <w:p>
-      <w:pPr>
-        <w:pStyle w:val="IJTechText"/>
-        <w:ind w:firstLine="283"/>
-      </w:pPr>
-      <w:r>
-        <w:t>dengan K adalah gain statis, τ konstanta waktu, dan L waktu tunda. Parameter K, τ, dan L diperoleh dari identifikasi respons step hasil eksperimen pada lengan robot nyata (nilai placeholder: K = a₁, τ = a₂, L = a₃).</w:t>
-      </w:r>
-    </w:p>
-    <w:p>
-      <w:pPr>
-        <w:pStyle w:val="IJTechText"/>
-        <w:ind w:firstLine="283"/>
-      </w:pPr>
-      <w:r>
-        <w:t>Penalaan PID dilakukan menggunakan metode Ziegler-Nichols closed-loop. Langkah-langkah: (1) set K_i=0, K_d=0, (2) tingkatkan K_p hingga sistem berosilasi pada frekuensi ultimat ω_u, catat K_u dan periode ultimat T_u, (3) hitung parameter PID berdasarkan Table 2.</w:t>
+        <w:t>Simulasi siklus diurnal mengungkap pola pembangkitan yang saling melengkapi antara kedua mekanisme. Table 2 merangkum keluaran daya dan efisiensi pada kedua mode operasi utama.</w:t>
       </w:r>
     </w:p>
     <w:p>
@@ -1574,7 +1058,7 @@
         <w:t>Table 2</w:t>
       </w:r>
       <w:r>
-        <w:t>. Parameter PID dari Metode Ziegler-Nichols Closed-Loop</w:t>
+        <w:t>. Kinerja Diurnal Sistem Hibrida</w:t>
       </w:r>
     </w:p>
     <w:tbl>
@@ -1611,7 +1095,7 @@
               <w:rPr>
                 <w:b/>
               </w:rPr>
-              <w:t>Tipe Kontrol</w:t>
+              <w:t>Mode Operasi</w:t>
             </w:r>
           </w:p>
         </w:tc>
@@ -1628,7 +1112,7 @@
               <w:rPr>
                 <w:b/>
               </w:rPr>
-              <w:t>\bK_p\b</w:t>
+              <w:t>Daya Keluaran</w:t>
             </w:r>
           </w:p>
         </w:tc>
@@ -1645,7 +1129,7 @@
               <w:rPr>
                 <w:b/>
               </w:rPr>
-              <w:t>\bT_i\b</w:t>
+              <w:t>Efisiensi Konversi</w:t>
             </w:r>
           </w:p>
         </w:tc>
@@ -1662,7 +1146,7 @@
               <w:rPr>
                 <w:b/>
               </w:rPr>
-              <w:t>\bT_d\b</w:t>
+              <w:t>Kontributor Utama</w:t>
             </w:r>
           </w:p>
         </w:tc>
@@ -1678,7 +1162,7 @@
             </w:pPr>
             <w:r/>
             <w:r>
-              <w:t>P</w:t>
+              <w:t>Siang (Puncak)</w:t>
             </w:r>
           </w:p>
         </w:tc>
@@ -1692,7 +1176,7 @@
             </w:pPr>
             <w:r/>
             <w:r>
-              <w:t>0.5 K_u</w:t>
+              <w:t>$P_{PV}$</w:t>
             </w:r>
           </w:p>
         </w:tc>
@@ -1706,7 +1190,7 @@
             </w:pPr>
             <w:r/>
             <w:r>
-              <w:t>∞</w:t>
+              <w:t>$\eta_{PV}$</w:t>
             </w:r>
           </w:p>
         </w:tc>
@@ -1720,7 +1204,7 @@
             </w:pPr>
             <w:r/>
             <w:r>
-              <w:t>0</w:t>
+              <w:t>Absorpsi Foton</w:t>
             </w:r>
           </w:p>
         </w:tc>
@@ -1736,7 +1220,7 @@
             </w:pPr>
             <w:r/>
             <w:r>
-              <w:t>PI</w:t>
+              <w:t>Malam (Puncak)</w:t>
             </w:r>
           </w:p>
         </w:tc>
@@ -1750,7 +1234,7 @@
             </w:pPr>
             <w:r/>
             <w:r>
-              <w:t>0.45 K_u</w:t>
+              <w:t>$P_{TRC}$</w:t>
             </w:r>
           </w:p>
         </w:tc>
@@ -1764,7 +1248,7 @@
             </w:pPr>
             <w:r/>
             <w:r>
-              <w:t>0.83 T_u</w:t>
+              <w:t>$\eta_{TRC}$</w:t>
             </w:r>
           </w:p>
         </w:tc>
@@ -1778,7 +1262,7 @@
             </w:pPr>
             <w:r/>
             <w:r>
-              <w:t>0</w:t>
+              <w:t>Emisi Inframerah</w:t>
             </w:r>
           </w:p>
         </w:tc>
@@ -1794,7 +1278,7 @@
             </w:pPr>
             <w:r/>
             <w:r>
-              <w:t>PID</w:t>
+              <w:t>Transisi (Senja/Fajar)</w:t>
             </w:r>
           </w:p>
         </w:tc>
@@ -1808,7 +1292,7 @@
             </w:pPr>
             <w:r/>
             <w:r>
-              <w:t>0.6 K_u</w:t>
+              <w:t>$P_{hybrid}$</w:t>
             </w:r>
           </w:p>
         </w:tc>
@@ -1822,7 +1306,7 @@
             </w:pPr>
             <w:r/>
             <w:r>
-              <w:t>0.5 T_u</w:t>
+              <w:t>$\eta_{trans}$</w:t>
             </w:r>
           </w:p>
         </w:tc>
@@ -1836,7 +1320,7 @@
             </w:pPr>
             <w:r/>
             <w:r>
-              <w:t>0.125 T_u</w:t>
+              <w:t>Kopling Termal</w:t>
             </w:r>
           </w:p>
         </w:tc>
@@ -1848,7 +1332,7 @@
         <w:ind w:firstLine="283"/>
       </w:pPr>
       <w:r>
-        <w:t>Setelah parameter PID diperoleh (K_p = a₄, K_i = a₅, K_d = a₆), simulasi dijalankan dengan sinyal referensi berupa step unit dan sinyal ramp yang merepresentasikan lintasan gerak kontinyu selama pengelasan. Skenario pengujian meliputi: (a) respons tanpa beban, (b) respons dengan beban elektroda (massa m = a₇ kg), (c) respons dengan gangguan sinusoidal (amplitude A = a₈, frekuensi f = a₉ Hz) mensimulasikan getaran konveyor.</w:t>
+        <w:t>Data pada Table 2 menunjukkan bahwa saat P_PV turun ke nol, P_TRC mengambil alih. Meski magnitudonya lebih kecil, kontinuitas ini mencegah sistem mencapai titik nol mutlak, sebuah keunggulan struktural dibanding PV mandiri.</w:t>
       </w:r>
     </w:p>
     <w:tbl>
@@ -1874,7 +1358,7 @@
               <w:rPr>
                 <w:i/>
               </w:rPr>
-              <w:t>[PROMPT UNTUK AI GAMBAR: Diagram alir prosedur penalaan PID dan simulasi. (create an image A flowchart illustrating the PID tuning and simulation procedure. Start with 'Mulai' (Start) oval. Then rectangles: 'Identifikasi plant (step test)' -&gt; 'Ukur K. τ, L' -&gt; 'Set Ki=0, Kd=0' -&gt; 'Naikkan Kp hingga osilasi stabil' -&gt; 'Catat Ku dan Tu' -&gt; 'Hitung Kp, Ki, Kd dari tabel ZN' -&gt; 'Implementasikan di Simulink' -&gt; 'Jalankan simulasi step dan ramp' -&gt; 'Catat respons (overshoot, settling time, rise time, steady-state error)'. A decision diamond after 'Catat respons': 'Overshoot &lt; 5%?' If YES: 'Selesai' (End). If NO: 'Sesuaikan Kp, Ki, Kd secara manual' and loop back to 'Implementasikan di Simulink'. Use standard flowchart symbols with arrows. Color: blue for process boxes, green for decision, red for start/end. Add labels for each symbol, but White background. Clean academic paper figure style.)]</w:t>
+              <w:t>[PROMPT UNTUK AI GAMBAR: Profil Daya 24 Jam Sistem Hibrida. (create an image "A line chart showing the 24-hour power generation profile of the Hybrid Solar-Lunar Cell. X-axis: 'Time (Hours)' from 0 to 24, but Y-axis: 'Power Density (W/m²)'. The chart features two stacked area curves: a large yellow/orange area representing PV Power ($P_{PV}$) peaking at solar noon (Hour 12) and dropping to zero at Hours 6 and 18. A smaller deep purple area representing TRC Power ($P_{TRC}$) that is near zero during the day but rises to a peak at Hour 0 (midnight) and maintains a baseline throughout the night. The transition periods (Hours 5-7 and 17-19) show a small overlapping region labeled 'Thermal Coupling Transition'. A dashed black line represents the 'Zero Power Baseline'. Title: 'Profil Pembangkitan Daya Diurnal'. Academic color palette, white background, clean figure style, clear legend.")]</w:t>
             </w:r>
           </w:p>
         </w:tc>
@@ -1889,10 +1373,10 @@
         <w:rPr>
           <w:b/>
         </w:rPr>
-        <w:t xml:space="preserve">Figure 3. </w:t>
-      </w:r>
-      <w:r>
-        <w:t>Diagram alir prosedur penalaan PID dan simulasi</w:t>
+        <w:t xml:space="preserve">Figure 6. </w:t>
+      </w:r>
+      <w:r>
+        <w:t>Profil Daya 24 Jam Sistem Hibrida</w:t>
       </w:r>
     </w:p>
     <w:p>
@@ -1901,590 +1385,7 @@
         <w:ind w:firstLine="283"/>
       </w:pPr>
       <w:r>
-        <w:t>Gambar 3 menunjukkan alur penalaan PID yang digunakan. Jika setelah penerapan parameter Ziegler-Nichols overshoot melebihi 5\%, dilakukan fine-tuning manual dengan mengurangi K_p dan menambah K_d untuk meredam osilasi.</w:t>
-      </w:r>
-    </w:p>
-    <w:p>
-      <w:pPr>
-        <w:pStyle w:val="IJTechSubheading"/>
-      </w:pPr>
-      <w:r>
-        <w:t>Algoritma Kendali dan Simulasi</w:t>
-      </w:r>
-    </w:p>
-    <w:p>
-      <w:pPr>
-        <w:pStyle w:val="IJTechText"/>
-        <w:ind w:firstLine="283"/>
-      </w:pPr>
-      <w:r>
-        <w:t>Implementasi algoritma kendali PID diskrit menggunakan metode backward difference untuk aproksimasi integral dan derivatif. Persamaan rekursif PID digital diberikan oleh</w:t>
-      </w:r>
-    </w:p>
-    <w:p>
-      <w:pPr>
-        <w:pStyle w:val="IJTechText"/>
-        <w:jc w:val="center"/>
-      </w:pPr>
-      <m:oMath xmlns:mml="http://www.w3.org/1998/Math/MathML">
-        <m:sSub>
-          <m:e>
-            <m:r>
-              <m:t>u</m:t>
-            </m:r>
-          </m:e>
-          <m:sub>
-            <m:r>
-              <m:t>k</m:t>
-            </m:r>
-          </m:sub>
-        </m:sSub>
-        <m:r>
-          <m:t>=</m:t>
-        </m:r>
-        <m:sSub>
-          <m:e>
-            <m:r>
-              <m:t>K</m:t>
-            </m:r>
-          </m:e>
-          <m:sub>
-            <m:r>
-              <m:t>p</m:t>
-            </m:r>
-          </m:sub>
-        </m:sSub>
-        <m:sSub>
-          <m:e>
-            <m:r>
-              <m:t>e</m:t>
-            </m:r>
-          </m:e>
-          <m:sub>
-            <m:r>
-              <m:t>k</m:t>
-            </m:r>
-          </m:sub>
-        </m:sSub>
-        <m:r>
-          <m:t>+</m:t>
-        </m:r>
-        <m:sSub>
-          <m:e>
-            <m:r>
-              <m:t>K</m:t>
-            </m:r>
-          </m:e>
-          <m:sub>
-            <m:r>
-              <m:t>i</m:t>
-            </m:r>
-          </m:sub>
-        </m:sSub>
-        <m:sSub>
-          <m:e>
-            <m:r>
-              <m:t>T</m:t>
-            </m:r>
-          </m:e>
-          <m:sub>
-            <m:r>
-              <m:t>s</m:t>
-            </m:r>
-          </m:sub>
-        </m:sSub>
-        <m:r>
-          <m:rPr>
-            <m:sty m:val="p"/>
-          </m:rPr>
-          <m:t>\sumj</m:t>
-        </m:r>
-        <m:r>
-          <m:t>=</m:t>
-        </m:r>
-        <m:sSup>
-          <m:e>
-            <m:r>
-              <m:t>0</m:t>
-            </m:r>
-          </m:e>
-          <m:sup>
-            <m:r>
-              <m:t>k</m:t>
-            </m:r>
-          </m:sup>
-        </m:sSup>
-        <m:sSub>
-          <m:e>
-            <m:r>
-              <m:t>e</m:t>
-            </m:r>
-          </m:e>
-          <m:sub>
-            <m:r>
-              <m:t>j</m:t>
-            </m:r>
-          </m:sub>
-        </m:sSub>
-        <m:r>
-          <m:t>+</m:t>
-        </m:r>
-        <m:f>
-          <m:fPr>
-            <m:type m:val="bar"/>
-          </m:fPr>
-          <m:num>
-            <m:sSub>
-              <m:e>
-                <m:r>
-                  <m:t>K</m:t>
-                </m:r>
-              </m:e>
-              <m:sub>
-                <m:r>
-                  <m:t>d</m:t>
-                </m:r>
-              </m:sub>
-            </m:sSub>
-          </m:num>
-          <m:den>
-            <m:sSub>
-              <m:e>
-                <m:r>
-                  <m:t>T</m:t>
-                </m:r>
-              </m:e>
-              <m:sub>
-                <m:r>
-                  <m:t>s</m:t>
-                </m:r>
-              </m:sub>
-            </m:sSub>
-          </m:den>
-        </m:f>
-        <m:r>
-          <m:t>(</m:t>
-        </m:r>
-        <m:sSub>
-          <m:e>
-            <m:r>
-              <m:t>e</m:t>
-            </m:r>
-          </m:e>
-          <m:sub>
-            <m:r>
-              <m:t>k</m:t>
-            </m:r>
-          </m:sub>
-        </m:sSub>
-        <m:r>
-          <m:t>−ek−1)</m:t>
-        </m:r>
-      </m:oMath>
-      <w:r>
-        <w:tab/>
-        <w:t>(5)</w:t>
-      </w:r>
-    </w:p>
-    <w:p>
-      <w:pPr>
-        <w:pStyle w:val="IJTechText"/>
-        <w:ind w:firstLine="283"/>
-      </w:pPr>
-      <w:r>
-        <w:t>dengan u_k adalah keluaran kontrol pada langkah ke-k, T_s adalah waktu cuplik (sampling time), e_k error pada langkah ke-k, dan e_k-1 error sebelumnya. Parameter K_p, K_i, K_d diperoleh dari Table 2. Waktu cuplik ditetapkan T_s = a₁0 ms, cukup cepat dibandingkan dinamika plant.</w:t>
-      </w:r>
-    </w:p>
-    <w:p>
-      <w:pPr>
-        <w:pStyle w:val="IJTechText"/>
-        <w:ind w:firstLine="283"/>
-      </w:pPr>
-      <w:r>
-        <w:t>Simulasi dilakukan untuk tiga konfigurasi kendali: PID, proporsional (P) murni dengan K_p=K_u/2, dan kendali on-off (bang-bang) dengan histeresis 0.1 mm. Skenario beban dan gangguan diterapkan secara terpisah. Metrik kinerja yang dicatat adalah overshoot (M_p), waktu naik (t_r), waktu penetapan (t_s) dengan kriteria 2%, dan kesalahan keadaan tunak (e_ss). Pengukuran dilakukan untuk respons step dan respons ramp (kecepatan konstan 0.1 m/s).</w:t>
-      </w:r>
-    </w:p>
-    <w:p>
-      <w:pPr>
-        <w:pStyle w:val="IJTechHeadingSection"/>
-      </w:pPr>
-      <w:r>
-        <w:t>HASIL DAN PEMBAHASAN</w:t>
-      </w:r>
-    </w:p>
-    <w:p>
-      <w:pPr>
-        <w:pStyle w:val="IJTechText"/>
-        <w:ind w:firstLine="283"/>
-      </w:pPr>
-      <w:r>
-        <w:t>Bab ini menyajikan hasil simulasi sistem kendali PID pada lengan robot serta analisis perbandingan dengan metode kendali lainnya.</w:t>
-      </w:r>
-    </w:p>
-    <w:p>
-      <w:pPr>
-        <w:pStyle w:val="IJTechSubheading"/>
-      </w:pPr>
-      <w:r>
-        <w:t>Hasil Simulasi Respons Step</w:t>
-      </w:r>
-    </w:p>
-    <w:p>
-      <w:pPr>
-        <w:pStyle w:val="IJTechText"/>
-        <w:ind w:firstLine="283"/>
-      </w:pPr>
-      <w:r>
-        <w:t>Hasil simulasi respons step untuk ketiga konfigurasi kendali tanpa beban tambahan disajikan pada Table 3. Parameter PID hasil penalaan Ziegler-Nichols adalah K_p = a₄, K_i = a₅, K_d = a₆. Dari tabel terlihat bahwa PID menghasilkan overshoot terkecil (M_p = X₁%) dibandingkan kendali P (M_p = X₂%) dan kendali on-off (M_p = X₃%). Waktu naik PID lebih cepat dibandingkan kendali P, namun lebih lambat daripada kendali on-off.</w:t>
-      </w:r>
-    </w:p>
-    <w:p>
-      <w:pPr>
-        <w:pStyle w:val="IJTechText"/>
-        <w:jc w:val="center"/>
-      </w:pPr>
-      <w:r>
-        <w:rPr>
-          <w:b/>
-        </w:rPr>
-        <w:t>Table 3</w:t>
-      </w:r>
-      <w:r>
-        <w:t>. Perbandingan Metrik Kinerja Respons Step Tanpa Beban</w:t>
-      </w:r>
-    </w:p>
-    <w:tbl>
-      <w:tblPr>
-        <w:tblW w:type="auto" w:w="0"/>
-        <w:jc w:val="center"/>
-        <w:tblLook w:firstColumn="1" w:firstRow="1" w:lastColumn="0" w:lastRow="0" w:noHBand="0" w:noVBand="1" w:val="04A0"/>
-        <w:tblBorders>
-          <w:top w:val="single" w:sz="4"/>
-          <w:left w:val="single" w:sz="4"/>
-          <w:bottom w:val="single" w:sz="4"/>
-          <w:right w:val="single" w:sz="4"/>
-          <w:insideH w:val="single" w:sz="4"/>
-          <w:insideV w:val="single" w:sz="4"/>
-        </w:tblBorders>
-      </w:tblPr>
-      <w:tblGrid>
-        <w:gridCol w:w="1949"/>
-        <w:gridCol w:w="1949"/>
-        <w:gridCol w:w="1949"/>
-        <w:gridCol w:w="1949"/>
-        <w:gridCol w:w="1949"/>
-      </w:tblGrid>
-      <w:tr>
-        <w:tc>
-          <w:tcPr>
-            <w:tcW w:type="dxa" w:w="1949"/>
-          </w:tcPr>
-          <w:p>
-            <w:pPr>
-              <w:jc w:val="center"/>
-            </w:pPr>
-            <w:r/>
-            <w:r>
-              <w:rPr>
-                <w:b/>
-              </w:rPr>
-              <w:t>Metode Kendali</w:t>
-            </w:r>
-          </w:p>
-        </w:tc>
-        <w:tc>
-          <w:tcPr>
-            <w:tcW w:type="dxa" w:w="1949"/>
-          </w:tcPr>
-          <w:p>
-            <w:pPr>
-              <w:jc w:val="center"/>
-            </w:pPr>
-            <w:r/>
-            <w:r>
-              <w:rPr>
-                <w:b/>
-              </w:rPr>
-              <w:t>\bOvershoot $M_p$ (%) \b</w:t>
-            </w:r>
-          </w:p>
-        </w:tc>
-        <w:tc>
-          <w:tcPr>
-            <w:tcW w:type="dxa" w:w="1949"/>
-          </w:tcPr>
-          <w:p>
-            <w:pPr>
-              <w:jc w:val="center"/>
-            </w:pPr>
-            <w:r/>
-            <w:r>
-              <w:rPr>
-                <w:b/>
-              </w:rPr>
-              <w:t>\bWaktu Naik $t_r$ (s) \b</w:t>
-            </w:r>
-          </w:p>
-        </w:tc>
-        <w:tc>
-          <w:tcPr>
-            <w:tcW w:type="dxa" w:w="1949"/>
-          </w:tcPr>
-          <w:p>
-            <w:pPr>
-              <w:jc w:val="center"/>
-            </w:pPr>
-            <w:r/>
-            <w:r>
-              <w:rPr>
-                <w:b/>
-              </w:rPr>
-              <w:t>\bWaktu Penetapan $t_s$ (s) \b</w:t>
-            </w:r>
-          </w:p>
-        </w:tc>
-        <w:tc>
-          <w:tcPr>
-            <w:tcW w:type="dxa" w:w="1949"/>
-          </w:tcPr>
-          <w:p>
-            <w:pPr>
-              <w:jc w:val="center"/>
-            </w:pPr>
-            <w:r/>
-            <w:r>
-              <w:rPr>
-                <w:b/>
-              </w:rPr>
-              <w:t>\bKesalahan Keadaan Tunak $e_{ss}$ (mm) \b</w:t>
-            </w:r>
-          </w:p>
-        </w:tc>
-      </w:tr>
-      <w:tr>
-        <w:tc>
-          <w:tcPr>
-            <w:tcW w:type="dxa" w:w="1949"/>
-          </w:tcPr>
-          <w:p>
-            <w:pPr>
-              <w:jc w:val="center"/>
-            </w:pPr>
-            <w:r/>
-            <w:r>
-              <w:t>PID</w:t>
-            </w:r>
-          </w:p>
-        </w:tc>
-        <w:tc>
-          <w:tcPr>
-            <w:tcW w:type="dxa" w:w="1949"/>
-          </w:tcPr>
-          <w:p>
-            <w:pPr>
-              <w:jc w:val="center"/>
-            </w:pPr>
-            <w:r/>
-            <w:r>
-              <w:t>X1</w:t>
-            </w:r>
-          </w:p>
-        </w:tc>
-        <w:tc>
-          <w:tcPr>
-            <w:tcW w:type="dxa" w:w="1949"/>
-          </w:tcPr>
-          <w:p>
-            <w:pPr>
-              <w:jc w:val="center"/>
-            </w:pPr>
-            <w:r/>
-            <w:r>
-              <w:t>X2</w:t>
-            </w:r>
-          </w:p>
-        </w:tc>
-        <w:tc>
-          <w:tcPr>
-            <w:tcW w:type="dxa" w:w="1949"/>
-          </w:tcPr>
-          <w:p>
-            <w:pPr>
-              <w:jc w:val="center"/>
-            </w:pPr>
-            <w:r/>
-            <w:r>
-              <w:t>X3</w:t>
-            </w:r>
-          </w:p>
-        </w:tc>
-        <w:tc>
-          <w:tcPr>
-            <w:tcW w:type="dxa" w:w="1949"/>
-          </w:tcPr>
-          <w:p>
-            <w:pPr>
-              <w:jc w:val="center"/>
-            </w:pPr>
-            <w:r/>
-            <w:r>
-              <w:t>X4</w:t>
-            </w:r>
-          </w:p>
-        </w:tc>
-      </w:tr>
-      <w:tr>
-        <w:tc>
-          <w:tcPr>
-            <w:tcW w:type="dxa" w:w="1949"/>
-          </w:tcPr>
-          <w:p>
-            <w:pPr>
-              <w:jc w:val="center"/>
-            </w:pPr>
-            <w:r/>
-            <w:r>
-              <w:t>Proporsional (P)</w:t>
-            </w:r>
-          </w:p>
-        </w:tc>
-        <w:tc>
-          <w:tcPr>
-            <w:tcW w:type="dxa" w:w="1949"/>
-          </w:tcPr>
-          <w:p>
-            <w:pPr>
-              <w:jc w:val="center"/>
-            </w:pPr>
-            <w:r/>
-            <w:r>
-              <w:t>X5</w:t>
-            </w:r>
-          </w:p>
-        </w:tc>
-        <w:tc>
-          <w:tcPr>
-            <w:tcW w:type="dxa" w:w="1949"/>
-          </w:tcPr>
-          <w:p>
-            <w:pPr>
-              <w:jc w:val="center"/>
-            </w:pPr>
-            <w:r/>
-            <w:r>
-              <w:t>X6</w:t>
-            </w:r>
-          </w:p>
-        </w:tc>
-        <w:tc>
-          <w:tcPr>
-            <w:tcW w:type="dxa" w:w="1949"/>
-          </w:tcPr>
-          <w:p>
-            <w:pPr>
-              <w:jc w:val="center"/>
-            </w:pPr>
-            <w:r/>
-            <w:r>
-              <w:t>X7</w:t>
-            </w:r>
-          </w:p>
-        </w:tc>
-        <w:tc>
-          <w:tcPr>
-            <w:tcW w:type="dxa" w:w="1949"/>
-          </w:tcPr>
-          <w:p>
-            <w:pPr>
-              <w:jc w:val="center"/>
-            </w:pPr>
-            <w:r/>
-            <w:r>
-              <w:t>X8</w:t>
-            </w:r>
-          </w:p>
-        </w:tc>
-      </w:tr>
-      <w:tr>
-        <w:tc>
-          <w:tcPr>
-            <w:tcW w:type="dxa" w:w="1949"/>
-          </w:tcPr>
-          <w:p>
-            <w:pPr>
-              <w:jc w:val="center"/>
-            </w:pPr>
-            <w:r/>
-            <w:r>
-              <w:t>On-Off</w:t>
-            </w:r>
-          </w:p>
-        </w:tc>
-        <w:tc>
-          <w:tcPr>
-            <w:tcW w:type="dxa" w:w="1949"/>
-          </w:tcPr>
-          <w:p>
-            <w:pPr>
-              <w:jc w:val="center"/>
-            </w:pPr>
-            <w:r/>
-            <w:r>
-              <w:t>X9</w:t>
-            </w:r>
-          </w:p>
-        </w:tc>
-        <w:tc>
-          <w:tcPr>
-            <w:tcW w:type="dxa" w:w="1949"/>
-          </w:tcPr>
-          <w:p>
-            <w:pPr>
-              <w:jc w:val="center"/>
-            </w:pPr>
-            <w:r/>
-            <w:r>
-              <w:t>X10</w:t>
-            </w:r>
-          </w:p>
-        </w:tc>
-        <w:tc>
-          <w:tcPr>
-            <w:tcW w:type="dxa" w:w="1949"/>
-          </w:tcPr>
-          <w:p>
-            <w:pPr>
-              <w:jc w:val="center"/>
-            </w:pPr>
-            <w:r/>
-            <w:r>
-              <w:t>X11</w:t>
-            </w:r>
-          </w:p>
-        </w:tc>
-        <w:tc>
-          <w:tcPr>
-            <w:tcW w:type="dxa" w:w="1949"/>
-          </w:tcPr>
-          <w:p>
-            <w:pPr>
-              <w:jc w:val="center"/>
-            </w:pPr>
-            <w:r/>
-            <w:r>
-              <w:t>X12</w:t>
-            </w:r>
-          </w:p>
-        </w:tc>
-      </w:tr>
-    </w:tbl>
-    <w:p>
-      <w:pPr>
-        <w:pStyle w:val="IJTechText"/>
-        <w:ind w:firstLine="283"/>
-      </w:pPr>
-      <w:r>
-        <w:t>Data pada Table 3 menunjukkan bahwa kendali PID mampu mencapai kesalahan keadaan tunak nol, sedangkan kendali P meninggalkan offset sekitar X₈ mm dan kendali on-off menghasilkan osilasi di sekitar set point dengan amplitudo X₁3 mm. Hal ini sesuai dengan teori bahwa aksi integral menghilangkan offset (Ogata, 2010). Overshoot PID yang kecil (X₁%) menunjukkan redaman yang baik, dicapai berkat aksi derivatif yang memberikan efek antisipatif.</w:t>
+        <w:t>Gambar 6 memvisualisasikan profil daya 24 jam ini. Transisi antara mode siang dan malam tidak terjadi secara instan. Ada periode senja di mana kedua mekanisme menghasilkan daya di bawah kapasitas puncak, menciptakan lembah pada kurva keluaran yang harus diantisipasi oleh manajemen grid.</w:t>
       </w:r>
     </w:p>
     <w:tbl>
@@ -2510,7 +1411,7 @@
               <w:rPr>
                 <w:i/>
               </w:rPr>
-              <w:t>[PROMPT UNTUK AI GAMBAR: Respons step sistem kendali posisi lengan robot dengan PID, P, dan On-Off. (create an image A line chart comparing step response of three control methods for a robot arm position control. X-axis: 'Time (s)' from 0 to 5 seconds. Y-axis: 'Position (mm)' from 0 to 12 mm. Three lines: (1) PID response in red: rises smoothly. reaches setpoint at 10 mm with small overshoot of X1% and settles at about 2.5s, steady-state error 0. (2) P-only response in blue: rises slightly slower, settles at about 9.5 mm (offset X8 mm), no overshoot. (3) On-Off response in green: fast rise but oscillates around 10 mm with amplitude X13 mm, never settles. All lines start at t=0. Add horizontal dashed line at 10 mm setpoint. Grid on, and and Title: 'Perbandingan Respons Step'. Legend: 'PID', 'Proporsional', 'On-Off', but Academic style, white background, clean figure. Use placeholder values for annotations: e.g., 'Overshoot PID: X1%'.)]</w:t>
+              <w:t>[PROMPT UNTUK AI GAMBAR: Efisiensi Total terhadap Suhu Ambien. (create an image "A scatter plot with a trend line showing the relationship between Ambient Temperature and Total Hybrid Efficiency. X-axis: 'Ambient Temperature, T_amb (K)' ranging from 280K to 320K. Y-axis: 'Total Hybrid Efficiency, η_hybrid (%)' ranging from 0% to 40%. The plot shows a negative correlation: as T_amb increases, the overall efficiency slightly decreases due to PV thermal losses outweighing TRC gains. Data points are represented by blue circles, and a dashed red line shows the linear regression fit. An annotation box highlights the 'Optimal Operating Range' between 290K and 300K. Title: 'Pengaruh Suhu Ambien terhadap Efisiensi Hibrida'. Academic color palette, white background, clean figure style, grid lines enabled.")]</w:t>
             </w:r>
           </w:p>
         </w:tc>
@@ -2525,10 +1426,10 @@
         <w:rPr>
           <w:b/>
         </w:rPr>
-        <w:t xml:space="preserve">Figure 4. </w:t>
-      </w:r>
-      <w:r>
-        <w:t>Respons step sistem kendali posisi lengan robot dengan PID, P, dan On-Off</w:t>
+        <w:t xml:space="preserve">Figure 7. </w:t>
+      </w:r>
+      <w:r>
+        <w:t>Efisiensi Total terhadap Suhu Ambien</w:t>
       </w:r>
     </w:p>
     <w:p>
@@ -2537,7 +1438,7 @@
         <w:ind w:firstLine="283"/>
       </w:pPr>
       <w:r>
-        <w:t>Gambar 4 memperlihatkan secara visual perbedaan kinerja ketiga kendali. Respons PID menunjukkan trade-off yang baik antara kecepatan dan kestabilan, sementara kendali P tidak mencapai set point, dan kendali on-off menghasilkan osilasi yang tidak dapat diterima untuk aplikasi pengelasan presisi.</w:t>
+        <w:t>Gambar 7 menunjukkan bagaimana efisiensi total (η_hybrid) berfluktuasi terhadap suhu ambien (T_amb). Menariknya, kenaikan suhu ambien justru menurunkan efisiensi total, karena kerugian termal pada lapisan PV jauh lebih dominan daripada peningkatan marginal pada emisi TRC.</w:t>
       </w:r>
     </w:p>
     <w:p>
@@ -2545,7 +1446,7 @@
         <w:pStyle w:val="IJTechSubheading"/>
       </w:pPr>
       <w:r>
-        <w:t>Analisis Respons terhadap Gangguan dan Beban</w:t>
+        <w:t>Analisis dan Pembahasan</w:t>
       </w:r>
     </w:p>
     <w:p>
@@ -2554,7 +1455,7 @@
         <w:ind w:firstLine="283"/>
       </w:pPr>
       <w:r>
-        <w:t>Pengujian dengan beban elektroda (massa a₇ kg) menunjukkan bahwa kendali PID tetap mampu mempertahankan kesalahan keadaan tunak nol, namun overshoot meningkat menjadi X₁4% dan waktu penetapan menjadi X₁5 s. Kendali P menunjukkan offset yang lebih besar (X₁6 mm), sedangkan kendali on-off menunjukkan osilasi dengan amplitudo lebih lebar (X₁7 mm). Hal ini konsisten dengan penelitian Kumar et al. (Kumar, 2021) yang menemukan bahwa beban meningkatkan overshoot pada kendali PID.</w:t>
+        <w:t>Mengapa kopling termal begitu krusial? Tanpa PCM, panas PV akan terbuang ke lingkungan melalui konveksi. Dengan PCM, panas itu disimpan dan memaksa emitor TRC tetap panas saat malam tiba, meningkatkan P_TRC secara signifikan. Table 3 membandingkan kinerja berbagai konfigurasi material dan ketebalan lapisan kopling.</w:t>
       </w:r>
     </w:p>
     <w:p>
@@ -2566,10 +1467,10 @@
         <w:rPr>
           <w:b/>
         </w:rPr>
-        <w:t>Table 4</w:t>
-      </w:r>
-      <w:r>
-        <w:t>. Pengaruh Beban Elektroda terhadap Kinerja Kendali PID</w:t>
+        <w:t>Table 3</w:t>
+      </w:r>
+      <w:r>
+        <w:t>. Perbandingan Konfigurasi Material dan Kopling</w:t>
       </w:r>
     </w:p>
     <w:tbl>
@@ -2606,7 +1507,7 @@
               <w:rPr>
                 <w:b/>
               </w:rPr>
-              <w:t>Kondisi</w:t>
+              <w:t>Konfigurasi</w:t>
             </w:r>
           </w:p>
         </w:tc>
@@ -2623,7 +1524,7 @@
               <w:rPr>
                 <w:b/>
               </w:rPr>
-              <w:t>\bOvershoot (%) \b</w:t>
+              <w:t>Resistansi Termal ($R_{th}$)</w:t>
             </w:r>
           </w:p>
         </w:tc>
@@ -2640,7 +1541,7 @@
               <w:rPr>
                 <w:b/>
               </w:rPr>
-              <w:t>\bWaktu Penetapan (s) \b</w:t>
+              <w:t>Daya Malam ($P_{TRC}$)</w:t>
             </w:r>
           </w:p>
         </w:tc>
@@ -2657,7 +1558,7 @@
               <w:rPr>
                 <w:b/>
               </w:rPr>
-              <w:t>\bKesalahan Tunak (mm) \b</w:t>
+              <w:t>Stabilitas Termal</w:t>
             </w:r>
           </w:p>
         </w:tc>
@@ -2673,7 +1574,7 @@
             </w:pPr>
             <w:r/>
             <w:r>
-              <w:t>Tanpa beban</w:t>
+              <w:t>Tanpa PCM (Baseline)</w:t>
             </w:r>
           </w:p>
         </w:tc>
@@ -2687,7 +1588,7 @@
             </w:pPr>
             <w:r/>
             <w:r>
-              <w:t>X1</w:t>
+              <w:t>Rendah</w:t>
             </w:r>
           </w:p>
         </w:tc>
@@ -2701,7 +1602,7 @@
             </w:pPr>
             <w:r/>
             <w:r>
-              <w:t>X3</w:t>
+              <w:t>$d_1$</w:t>
             </w:r>
           </w:p>
         </w:tc>
@@ -2715,7 +1616,7 @@
             </w:pPr>
             <w:r/>
             <w:r>
-              <w:t>0</w:t>
+              <w:t>Buruk</w:t>
             </w:r>
           </w:p>
         </w:tc>
@@ -2731,7 +1632,7 @@
             </w:pPr>
             <w:r/>
             <w:r>
-              <w:t>Dengan beban</w:t>
+              <w:t>PCM Organik (Parafin)</w:t>
             </w:r>
           </w:p>
         </w:tc>
@@ -2745,7 +1646,7 @@
             </w:pPr>
             <w:r/>
             <w:r>
-              <w:t>X14</w:t>
+              <w:t>Sedang</w:t>
             </w:r>
           </w:p>
         </w:tc>
@@ -2759,7 +1660,7 @@
             </w:pPr>
             <w:r/>
             <w:r>
-              <w:t>X15</w:t>
+              <w:t>$d_2$</w:t>
             </w:r>
           </w:p>
         </w:tc>
@@ -2773,7 +1674,123 @@
             </w:pPr>
             <w:r/>
             <w:r>
-              <w:t>0</w:t>
+              <w:t>Baik</w:t>
+            </w:r>
+          </w:p>
+        </w:tc>
+      </w:tr>
+      <w:tr>
+        <w:tc>
+          <w:tcPr>
+            <w:tcW w:type="dxa" w:w="2436"/>
+          </w:tcPr>
+          <w:p>
+            <w:pPr>
+              <w:jc w:val="center"/>
+            </w:pPr>
+            <w:r/>
+            <w:r>
+              <w:t>PCM Anorganik (Garam)</w:t>
+            </w:r>
+          </w:p>
+        </w:tc>
+        <w:tc>
+          <w:tcPr>
+            <w:tcW w:type="dxa" w:w="2436"/>
+          </w:tcPr>
+          <w:p>
+            <w:pPr>
+              <w:jc w:val="center"/>
+            </w:pPr>
+            <w:r/>
+            <w:r>
+              <w:t>Tinggi</w:t>
+            </w:r>
+          </w:p>
+        </w:tc>
+        <w:tc>
+          <w:tcPr>
+            <w:tcW w:type="dxa" w:w="2436"/>
+          </w:tcPr>
+          <w:p>
+            <w:pPr>
+              <w:jc w:val="center"/>
+            </w:pPr>
+            <w:r/>
+            <w:r>
+              <w:t>$d_3$</w:t>
+            </w:r>
+          </w:p>
+        </w:tc>
+        <w:tc>
+          <w:tcPr>
+            <w:tcW w:type="dxa" w:w="2436"/>
+          </w:tcPr>
+          <w:p>
+            <w:pPr>
+              <w:jc w:val="center"/>
+            </w:pPr>
+            <w:r/>
+            <w:r>
+              <w:t>Sangat Baik</w:t>
+            </w:r>
+          </w:p>
+        </w:tc>
+      </w:tr>
+      <w:tr>
+        <w:tc>
+          <w:tcPr>
+            <w:tcW w:type="dxa" w:w="2436"/>
+          </w:tcPr>
+          <w:p>
+            <w:pPr>
+              <w:jc w:val="center"/>
+            </w:pPr>
+            <w:r/>
+            <w:r>
+              <w:t>Kopling Langsung (Tanpa Isolasi)</w:t>
+            </w:r>
+          </w:p>
+        </w:tc>
+        <w:tc>
+          <w:tcPr>
+            <w:tcW w:type="dxa" w:w="2436"/>
+          </w:tcPr>
+          <w:p>
+            <w:pPr>
+              <w:jc w:val="center"/>
+            </w:pPr>
+            <w:r/>
+            <w:r>
+              <w:t>Sangat Rendah</w:t>
+            </w:r>
+          </w:p>
+        </w:tc>
+        <w:tc>
+          <w:tcPr>
+            <w:tcW w:type="dxa" w:w="2436"/>
+          </w:tcPr>
+          <w:p>
+            <w:pPr>
+              <w:jc w:val="center"/>
+            </w:pPr>
+            <w:r/>
+            <w:r>
+              <w:t>$d_4$</w:t>
+            </w:r>
+          </w:p>
+        </w:tc>
+        <w:tc>
+          <w:tcPr>
+            <w:tcW w:type="dxa" w:w="2436"/>
+          </w:tcPr>
+          <w:p>
+            <w:pPr>
+              <w:jc w:val="center"/>
+            </w:pPr>
+            <w:r/>
+            <w:r>
+              <w:t>Buruk</w:t>
             </w:r>
           </w:p>
         </w:tc>
@@ -2785,48 +1802,7 @@
         <w:ind w:firstLine="283"/>
       </w:pPr>
       <w:r>
-        <w:t>Hasil pada Table 4 mengindikasikan bahwa sistem kendali PID dapat mengkompensasi efek beban karena aksi integral, meskipun overshoot meningkat. Untuk mengurangi overshoot, dapat dilakukan fine-tuning dengan menurunkan K_p dan menaikkan K_d secara manual.</w:t>
-      </w:r>
-    </w:p>
-    <w:p>
-      <w:pPr>
-        <w:pStyle w:val="IJTechText"/>
-        <w:ind w:firstLine="283"/>
-      </w:pPr>
-      <w:r>
-        <w:t>Saat gangguan sinusoidal (getaran konveyor) diterapkan dengan amplitudo a₈ dan frekuensi a₉ Hz, kesalahan jejak lintasan ramp meningkat. PID menghasilkan error RMS sebesar X₁8 mm, lebih kecil dibandingkan kendali P (X₁9 mm) dan kendali on-off (X₂0 mm). Hal ini menunjukkan bahwa PID memberikan atenuasi gangguan yang lebih baik (Smith, 2019).</w:t>
-      </w:r>
-    </w:p>
-    <w:p>
-      <w:pPr>
-        <w:pStyle w:val="IJTechSubheading"/>
-      </w:pPr>
-      <w:r>
-        <w:t>Perbandingan dengan Metode Kendali Lain dari Literatur</w:t>
-      </w:r>
-    </w:p>
-    <w:p>
-      <w:pPr>
-        <w:pStyle w:val="IJTechText"/>
-        <w:ind w:firstLine="283"/>
-      </w:pPr>
-      <w:r>
-        <w:t>Untuk memvalidasi hasil penelitian, dilakukan perbandingan dengan hasil dari studi sebelumnya. Table 5 menyajikan perbandingan metrik kinerja dengan beberapa metode kendali dari literatur. Metode PID yang dirancang dalam penelitian ini menghasilkan overshoot X₁% yang sebanding dengan PID adaptif Smith (Smith, 2019) (Y₁%) dan lebih baik dari PID tetap pada studi Chen (Chen, 2020) (Y₂%).</w:t>
-      </w:r>
-    </w:p>
-    <w:p>
-      <w:pPr>
-        <w:pStyle w:val="IJTechText"/>
-        <w:jc w:val="center"/>
-      </w:pPr>
-      <w:r>
-        <w:rPr>
-          <w:b/>
-        </w:rPr>
-        <w:t>Table 5</w:t>
-      </w:r>
-      <w:r>
-        <w:t>. Perbandingan Kinerja dengan Metode dari Literatur</w:t>
+        <w:t>Anomali muncul pada konfigurasi dengan resistansi termal sangat rendah (kopling langsung). Alih-alih meningkatkan efisiensi, isolasi yang buruk justru membuat lapisan PV kepanasan (thermal runaway) di siang hari, menurunkan P_PV lebih besar daripada kenaikan P_TRC di malam hari. Ini membuktikan bahwa resistansi termal antarmuka harus dioptimalkan, bukan sekadar diminimalkan.</w:t>
       </w:r>
     </w:p>
     <w:tbl>
@@ -2834,25 +1810,14 @@
         <w:tblW w:type="auto" w:w="0"/>
         <w:jc w:val="center"/>
         <w:tblLook w:firstColumn="1" w:firstRow="1" w:lastColumn="0" w:lastRow="0" w:noHBand="0" w:noVBand="1" w:val="04A0"/>
-        <w:tblBorders>
-          <w:top w:val="single" w:sz="4"/>
-          <w:left w:val="single" w:sz="4"/>
-          <w:bottom w:val="single" w:sz="4"/>
-          <w:right w:val="single" w:sz="4"/>
-          <w:insideH w:val="single" w:sz="4"/>
-          <w:insideV w:val="single" w:sz="4"/>
-        </w:tblBorders>
       </w:tblPr>
       <w:tblGrid>
-        <w:gridCol w:w="2436"/>
-        <w:gridCol w:w="2436"/>
-        <w:gridCol w:w="2436"/>
-        <w:gridCol w:w="2436"/>
+        <w:gridCol w:w="9746"/>
       </w:tblGrid>
       <w:tr>
         <w:tc>
           <w:tcPr>
-            <w:tcW w:type="dxa" w:w="2436"/>
+            <w:tcW w:type="dxa" w:w="9746"/>
           </w:tcPr>
           <w:p>
             <w:pPr>
@@ -2861,350 +1826,9 @@
             <w:r/>
             <w:r>
               <w:rPr>
-                <w:b/>
+                <w:i/>
               </w:rPr>
-              <w:t>Metode</w:t>
-            </w:r>
-          </w:p>
-        </w:tc>
-        <w:tc>
-          <w:tcPr>
-            <w:tcW w:type="dxa" w:w="2436"/>
-          </w:tcPr>
-          <w:p>
-            <w:pPr>
-              <w:jc w:val="center"/>
-            </w:pPr>
-            <w:r/>
-            <w:r>
-              <w:rPr>
-                <w:b/>
-              </w:rPr>
-              <w:t>\bOvershoot (%) \b</w:t>
-            </w:r>
-          </w:p>
-        </w:tc>
-        <w:tc>
-          <w:tcPr>
-            <w:tcW w:type="dxa" w:w="2436"/>
-          </w:tcPr>
-          <w:p>
-            <w:pPr>
-              <w:jc w:val="center"/>
-            </w:pPr>
-            <w:r/>
-            <w:r>
-              <w:rPr>
-                <w:b/>
-              </w:rPr>
-              <w:t>\bWaktu Penetapan (s) \b</w:t>
-            </w:r>
-          </w:p>
-        </w:tc>
-        <w:tc>
-          <w:tcPr>
-            <w:tcW w:type="dxa" w:w="2436"/>
-          </w:tcPr>
-          <w:p>
-            <w:pPr>
-              <w:jc w:val="center"/>
-            </w:pPr>
-            <w:r/>
-            <w:r>
-              <w:rPr>
-                <w:b/>
-              </w:rPr>
-              <w:t>\bKesalahan Tunak (mm) \b</w:t>
-            </w:r>
-          </w:p>
-        </w:tc>
-      </w:tr>
-      <w:tr>
-        <w:tc>
-          <w:tcPr>
-            <w:tcW w:type="dxa" w:w="2436"/>
-          </w:tcPr>
-          <w:p>
-            <w:pPr>
-              <w:jc w:val="center"/>
-            </w:pPr>
-            <w:r/>
-            <w:r>
-              <w:t>PID Ziegler-Nichols (penelitian ini)</w:t>
-            </w:r>
-          </w:p>
-        </w:tc>
-        <w:tc>
-          <w:tcPr>
-            <w:tcW w:type="dxa" w:w="2436"/>
-          </w:tcPr>
-          <w:p>
-            <w:pPr>
-              <w:jc w:val="center"/>
-            </w:pPr>
-            <w:r/>
-            <w:r>
-              <w:t>X1</w:t>
-            </w:r>
-          </w:p>
-        </w:tc>
-        <w:tc>
-          <w:tcPr>
-            <w:tcW w:type="dxa" w:w="2436"/>
-          </w:tcPr>
-          <w:p>
-            <w:pPr>
-              <w:jc w:val="center"/>
-            </w:pPr>
-            <w:r/>
-            <w:r>
-              <w:t>X3</w:t>
-            </w:r>
-          </w:p>
-        </w:tc>
-        <w:tc>
-          <w:tcPr>
-            <w:tcW w:type="dxa" w:w="2436"/>
-          </w:tcPr>
-          <w:p>
-            <w:pPr>
-              <w:jc w:val="center"/>
-            </w:pPr>
-            <w:r/>
-            <w:r>
-              <w:t>0</w:t>
-            </w:r>
-          </w:p>
-        </w:tc>
-      </w:tr>
-      <w:tr>
-        <w:tc>
-          <w:tcPr>
-            <w:tcW w:type="dxa" w:w="2436"/>
-          </w:tcPr>
-          <w:p>
-            <w:pPr>
-              <w:jc w:val="center"/>
-            </w:pPr>
-            <w:r/>
-            <w:r>
-              <w:t>PID Adaptif RLS [6]</w:t>
-            </w:r>
-          </w:p>
-        </w:tc>
-        <w:tc>
-          <w:tcPr>
-            <w:tcW w:type="dxa" w:w="2436"/>
-          </w:tcPr>
-          <w:p>
-            <w:pPr>
-              <w:jc w:val="center"/>
-            </w:pPr>
-            <w:r/>
-            <w:r>
-              <w:t>Y1</w:t>
-            </w:r>
-          </w:p>
-        </w:tc>
-        <w:tc>
-          <w:tcPr>
-            <w:tcW w:type="dxa" w:w="2436"/>
-          </w:tcPr>
-          <w:p>
-            <w:pPr>
-              <w:jc w:val="center"/>
-            </w:pPr>
-            <w:r/>
-            <w:r>
-              <w:t>Y3</w:t>
-            </w:r>
-          </w:p>
-        </w:tc>
-        <w:tc>
-          <w:tcPr>
-            <w:tcW w:type="dxa" w:w="2436"/>
-          </w:tcPr>
-          <w:p>
-            <w:pPr>
-              <w:jc w:val="center"/>
-            </w:pPr>
-            <w:r/>
-            <w:r>
-              <w:t>0</w:t>
-            </w:r>
-          </w:p>
-        </w:tc>
-      </w:tr>
-      <w:tr>
-        <w:tc>
-          <w:tcPr>
-            <w:tcW w:type="dxa" w:w="2436"/>
-          </w:tcPr>
-          <w:p>
-            <w:pPr>
-              <w:jc w:val="center"/>
-            </w:pPr>
-            <w:r/>
-            <w:r>
-              <w:t>PID + Neural Network [7]</w:t>
-            </w:r>
-          </w:p>
-        </w:tc>
-        <w:tc>
-          <w:tcPr>
-            <w:tcW w:type="dxa" w:w="2436"/>
-          </w:tcPr>
-          <w:p>
-            <w:pPr>
-              <w:jc w:val="center"/>
-            </w:pPr>
-            <w:r/>
-            <w:r>
-              <w:t>Y2</w:t>
-            </w:r>
-          </w:p>
-        </w:tc>
-        <w:tc>
-          <w:tcPr>
-            <w:tcW w:type="dxa" w:w="2436"/>
-          </w:tcPr>
-          <w:p>
-            <w:pPr>
-              <w:jc w:val="center"/>
-            </w:pPr>
-            <w:r/>
-            <w:r>
-              <w:t>Y4</w:t>
-            </w:r>
-          </w:p>
-        </w:tc>
-        <w:tc>
-          <w:tcPr>
-            <w:tcW w:type="dxa" w:w="2436"/>
-          </w:tcPr>
-          <w:p>
-            <w:pPr>
-              <w:jc w:val="center"/>
-            </w:pPr>
-            <w:r/>
-            <w:r>
-              <w:t>0</w:t>
-            </w:r>
-          </w:p>
-        </w:tc>
-      </w:tr>
-      <w:tr>
-        <w:tc>
-          <w:tcPr>
-            <w:tcW w:type="dxa" w:w="2436"/>
-          </w:tcPr>
-          <w:p>
-            <w:pPr>
-              <w:jc w:val="center"/>
-            </w:pPr>
-            <w:r/>
-            <w:r>
-              <w:t>Kendali Logika Fuzzy [8]</w:t>
-            </w:r>
-          </w:p>
-        </w:tc>
-        <w:tc>
-          <w:tcPr>
-            <w:tcW w:type="dxa" w:w="2436"/>
-          </w:tcPr>
-          <w:p>
-            <w:pPr>
-              <w:jc w:val="center"/>
-            </w:pPr>
-            <w:r/>
-            <w:r>
-              <w:t>Y5</w:t>
-            </w:r>
-          </w:p>
-        </w:tc>
-        <w:tc>
-          <w:tcPr>
-            <w:tcW w:type="dxa" w:w="2436"/>
-          </w:tcPr>
-          <w:p>
-            <w:pPr>
-              <w:jc w:val="center"/>
-            </w:pPr>
-            <w:r/>
-            <w:r>
-              <w:t>Y6</w:t>
-            </w:r>
-          </w:p>
-        </w:tc>
-        <w:tc>
-          <w:tcPr>
-            <w:tcW w:type="dxa" w:w="2436"/>
-          </w:tcPr>
-          <w:p>
-            <w:pPr>
-              <w:jc w:val="center"/>
-            </w:pPr>
-            <w:r/>
-            <w:r>
-              <w:t>0</w:t>
-            </w:r>
-          </w:p>
-        </w:tc>
-      </w:tr>
-      <w:tr>
-        <w:tc>
-          <w:tcPr>
-            <w:tcW w:type="dxa" w:w="2436"/>
-          </w:tcPr>
-          <w:p>
-            <w:pPr>
-              <w:jc w:val="center"/>
-            </w:pPr>
-            <w:r/>
-            <w:r>
-              <w:t>PID Standar [9]</w:t>
-            </w:r>
-          </w:p>
-        </w:tc>
-        <w:tc>
-          <w:tcPr>
-            <w:tcW w:type="dxa" w:w="2436"/>
-          </w:tcPr>
-          <w:p>
-            <w:pPr>
-              <w:jc w:val="center"/>
-            </w:pPr>
-            <w:r/>
-            <w:r>
-              <w:t>Y7</w:t>
-            </w:r>
-          </w:p>
-        </w:tc>
-        <w:tc>
-          <w:tcPr>
-            <w:tcW w:type="dxa" w:w="2436"/>
-          </w:tcPr>
-          <w:p>
-            <w:pPr>
-              <w:jc w:val="center"/>
-            </w:pPr>
-            <w:r/>
-            <w:r>
-              <w:t>Y8</w:t>
-            </w:r>
-          </w:p>
-        </w:tc>
-        <w:tc>
-          <w:tcPr>
-            <w:tcW w:type="dxa" w:w="2436"/>
-          </w:tcPr>
-          <w:p>
-            <w:pPr>
-              <w:jc w:val="center"/>
-            </w:pPr>
-            <w:r/>
-            <w:r>
-              <w:t>Y9</w:t>
+              <w:t>[PROMPT UNTUK AI GAMBAR: Tumpang Tindih Spektral dan Rugi Refleksi. (create an image "A stacked bar chart analyzing Spectral Overlap and Reflection Losses across different interface materials. X-axis: 'Interface Material Type' (Category A: Air Gap, Category B: Optical Gel, Category C: Nanostructured Metamaterial). Y-axis: 'Percentage of Incident Energy (%)' from 0 to 100. Each bar is divided into three segments: 'Useful PV Absorption' (blue), 'Useful TRC Transmission' (purple), and 'Interface Reflection Loss' (red). Category C shows the lowest red segment (minimal loss) and highest combined blue/purple segments. Title: 'Distribusi Energi Spektral pada Antarmuka'. Academic color palette, white background, clean figure style, data labels on segments.")]</w:t>
             </w:r>
           </w:p>
         </w:tc>
@@ -3213,10 +1837,16 @@
     <w:p>
       <w:pPr>
         <w:pStyle w:val="IJTechText"/>
-        <w:ind w:firstLine="283"/>
-      </w:pPr>
-      <w:r>
-        <w:t>Data pada Table 5 menunjukkan bahwa kendali logika fuzzy (Kumar, 2021) unggul dalam waktu penetapan (Y₆ s) namun memerlukan tuning rule base yang kompleks, sementara itu, PID adaptif (Smith, 2019) memberikan overshoot lebih kecil (Y₁%) tetapi implementasinya lebih berat secara komputasi. Penelitian ini memberikan solusi sederhana dengan kinerja yang kompetitif, terutama untuk aplikasi dengan sumber daya komputasi terbatas.</w:t>
+        <w:jc w:val="center"/>
+      </w:pPr>
+      <w:r>
+        <w:rPr>
+          <w:b/>
+        </w:rPr>
+        <w:t xml:space="preserve">Figure 8. </w:t>
+      </w:r>
+      <w:r>
+        <w:t>Tumpang Tindih Spektral dan Rugi Refleksi</w:t>
       </w:r>
     </w:p>
     <w:p>
@@ -3225,15 +1855,51 @@
         <w:ind w:firstLine="283"/>
       </w:pPr>
       <w:r>
-        <w:t>Perlu dicatat bahwa data pembanding dari literatur diperoleh dari simulasi atau eksperimen dengan spesifikasi robot yang berbeda, sehingga perbandingan hanya bersifat indikatif. Meskipun demikian, kecenderungan menunjukkan bahwa PID yang dituning dengan Ziegler-Nichols memberikan baseline yang baik.</w:t>
-      </w:r>
-    </w:p>
-    <w:p>
-      <w:pPr>
-        <w:pStyle w:val="IJTechSubheading"/>
-      </w:pPr>
-      <w:r>
-        <w:t>Diskusi dan Keterbatasan</w:t>
+        <w:t>Gambar 8 memetakan tumpang tindih spektral yang hilang akibat refleksi antarmuka. Penggunaan metamaterial nano-struktur (Kategori C) secara drastis menekan rugi-rugi refleksi, memungkinkan foton inframerah jauh menembus lapisan PV tanpa terserap atau dipantulkan.</w:t>
+      </w:r>
+    </w:p>
+    <w:tbl>
+      <w:tblPr>
+        <w:tblW w:type="auto" w:w="0"/>
+        <w:jc w:val="center"/>
+        <w:tblLook w:firstColumn="1" w:firstRow="1" w:lastColumn="0" w:lastRow="0" w:noHBand="0" w:noVBand="1" w:val="04A0"/>
+      </w:tblPr>
+      <w:tblGrid>
+        <w:gridCol w:w="9746"/>
+      </w:tblGrid>
+      <w:tr>
+        <w:tc>
+          <w:tcPr>
+            <w:tcW w:type="dxa" w:w="9746"/>
+          </w:tcPr>
+          <w:p>
+            <w:pPr>
+              <w:jc w:val="center"/>
+            </w:pPr>
+            <w:r/>
+            <w:r>
+              <w:rPr>
+                <w:i/>
+              </w:rPr>
+              <w:t>[PROMPT UNTUK AI GAMBAR: Perbandingan Total Energi Harian. (create an image "A grouped bar chart comparing the Total Daily Energy Yield of three system configurations. X-axis: 'System Configuration' (1, but PV Standalone, 2. PV + Battery, 3, and Hybrid Solar-Lunar Cell). Y-axis: 'Daily Energy Yield (Wh/m²)'. Data: PV Standalone shows only Daytime Energy (yellow bar, value h1), Nighttime is 0. PV + Battery shows Daytime Energy (yellow bar, value h2, slightly lower due to charging losses) and Nighttime Energy from Battery (grey bar, value i1). Hybrid Cell shows Daytime PV Energy (yellow bar, value h3) and Nighttime TRC Energy (purple bar, value i2). The Hybrid cell eliminates battery degradation costs, and Title: 'Perbandingan Yield Energi Harian'. Academic color palette, white background, clean figure style, clear legend.")]</w:t>
+            </w:r>
+          </w:p>
+        </w:tc>
+      </w:tr>
+    </w:tbl>
+    <w:p>
+      <w:pPr>
+        <w:pStyle w:val="IJTechText"/>
+        <w:jc w:val="center"/>
+      </w:pPr>
+      <w:r>
+        <w:rPr>
+          <w:b/>
+        </w:rPr>
+        <w:t xml:space="preserve">Figure 9. </w:t>
+      </w:r>
+      <w:r>
+        <w:t>Perbandingan Total Energi Harian</w:t>
       </w:r>
     </w:p>
     <w:p>
@@ -3242,7 +1908,15 @@
         <w:ind w:firstLine="283"/>
       </w:pPr>
       <w:r>
-        <w:t>Hasil simulasi menunjukkan bahwa kendali PID mampu mencapai presisi pengelasan yang memadai dengan kesalahan keadaan tunak nol dan overshoot yang terkendali, namun, terdapat keterbatasan yang perlu dicatat. Pertama, metode Ziegler-Nichols cenderung menghasilkan overshoot yang agak besar pada beberapa plant dengan dominasi delay. Dalam penelitian ini, overshoot masih dapat diterima (&lt; 5%), namun untuk aplikasi yang sangat kritis mungkin diperlukan penalaan lebih lanjut. Kedua, simulasi menggunakan model plant yang disederhanakan (orde satu plus tunda), belum mencakup efek kopling antar sendi dan non-linearitas gesekan Coulomb.</w:t>
+        <w:t>Gambar 9 merangkum total energi harian (E_daily) yang dihasilkan oleh sistem hibrida dibandingkan dengan sistem PV mandiri plus baterai. Hasil ini menantang asumsi bahwa baterai adalah satu-satunya solusi untuk intermitensi. Meski TRC belum bisa menggantikan kapasitas baterai sepenuhnya untuk beban berat, ia memangkas kebutuhan ukuran bank baterai secara drastis untuk aplikasi penerangan dan sensor IoT.</w:t>
+      </w:r>
+    </w:p>
+    <w:p>
+      <w:pPr>
+        <w:pStyle w:val="IJTechHeadingSection"/>
+      </w:pPr>
+      <w:r>
+        <w:t>KESIMPULAN</w:t>
       </w:r>
     </w:p>
     <w:p>
@@ -3251,7 +1925,7 @@
         <w:ind w:firstLine="283"/>
       </w:pPr>
       <w:r>
-        <w:t>Selain itu, penelitian ini hanya menguji kinerja dalam domain waktu untuk sinyal step dan ramp, belum mencakup trajektori pengelasan aktual yang melibatkan gerakan simultan beberapa sendi. Gangguan yang digunakan (sinusoidal) juga belum sepenuhnya mewakili realitas getaran pabrik yang lebih kompleks. Oleh karena itu, hasil ini perlu divalidasi dengan eksperimen nyata pada lengan robot industri.</w:t>
+        <w:t>Arsitektur Sel Hibrida Solar-Lunar yang kami modelkan membuktikan bahwa pembangkitan daya 24 jam tanpa jeda secara termodinamika dimungkinkan. Kopling termal melalui lapisan PCM berhasil mendaur ulang limbah panas fotovoltaik menjadi bahan bakar bagi emisi termoradiatif malam hari. Variabel E_daily menunjukkan peningkatan yield energi yang substansial dibandingkan sistem PV konvensional, sekaligus mengurangi ketergantungan pada penyimpanan elektrokimia.</w:t>
       </w:r>
     </w:p>
     <w:p>
@@ -3260,15 +1934,7 @@
         <w:ind w:firstLine="283"/>
       </w:pPr>
       <w:r>
-        <w:t>Di sisi lain, kelebihan dari pendekatan ini adalah kemudahan implementasi pada pengontrol industri standar (PLC, mikrokontroler) karena algoritma PID yang sederhana. Perbandingan dengan metode lain menunjukkan bahwa PID dapat menjadi pilihan yang efisien dalam hal sumber daya komputasi. Untuk peningkatan lebih lanjut, integrasi dengan kompensasi feedforward dan filter low-pass pada aksi derivatif dapat dipertimbangkan.</w:t>
-      </w:r>
-    </w:p>
-    <w:p>
-      <w:pPr>
-        <w:pStyle w:val="IJTechHeadingSection"/>
-      </w:pPr>
-      <w:r>
-        <w:t>KESIMPULAN</w:t>
+        <w:t>Tapi kami harus jujur tentang batasannya. Model ini masih mengandalkan asumsi idealitas dioda dan mengabaikan degradasi material akibat siklus termal harian yang ekstrem. Resistansi antarmuka (R_th) di dunia nyata pasti lebih tinggi daripada yang kami simulasikan. dan efisiensi konversi TRC masih sangat rentan terhadap kelembaban atmosfer yang memblokir jendela inframerah.</w:t>
       </w:r>
     </w:p>
     <w:p>
@@ -3277,25 +1943,7 @@
         <w:ind w:firstLine="283"/>
       </w:pPr>
       <w:r>
-        <w:t>Penelitian ini berhasil merancang sistem kendali PID untuk lengan robot industri enam derajat kebebasan guna meningkatkan presisi pengelasan komponen otomotif. Melalui pemodelan kinematik Denavit-Hartenberg dan penalaan parameter menggunakan metode Ziegler-Nichols closed-loop, diperoleh respons sistem yang memenuhi kriteria overshoot rendah dan kesalahan keadaan tunak nol. Hasil simulasi menunjukkan bahwa kendali PID mampu mencapai overshoot X₁%, waktu naik X₂ detik, dan waktu penetapan X₃ detik pada respons step tanpa beban. Saat diberikan beban elektroda dan gangguan getaran, kesalahan jejak lintasan masih dalam batas toleransi pengelasan.</w:t>
-      </w:r>
-    </w:p>
-    <w:p>
-      <w:pPr>
-        <w:pStyle w:val="IJTechText"/>
-        <w:ind w:firstLine="283"/>
-      </w:pPr>
-      <w:r>
-        <w:t>Perbandingan dengan kendali proporsional murni dan kendali on-off menunjukkan keunggulan PID dalam hal eliminasi offset dan peredaman osilasi. Analisis dengan literatur memperkuat bahwa pendekatan Ziegler-Nichols memberikan parameter awal yang baik, meskipun overshoot masih dapat ditingkatkan lebih lanjut. Keterbatasan penelitian meliputi penyederhanaan model plant dan belum adanya validasi eksperimental nyata. Selain itu, pengaruh kopling antar sendi tidak dimodelkan secara eksplisit.</w:t>
-      </w:r>
-    </w:p>
-    <w:p>
-      <w:pPr>
-        <w:pStyle w:val="IJTechText"/>
-        <w:ind w:firstLine="283"/>
-      </w:pPr>
-      <w:r>
-        <w:t>Untuk penelitian selanjutnya, beberapa arah pengembangan yang direkomendasikan adalah: (1) penerapan metode penalaan otomatis seperti Particle Swarm Optimization (PSO) atau Iterative Feedback Tuning (IFT) untuk mengoptimalkan parameter PID secara adaptif terhadap perubahan beban, (2) integrasi dengan sensor gaya untuk kompensasi gaya kontak selama pengelasan, (3) pengujian pada robot nyata dengan variasi kecepatan pengelasan dan material yang berbeda, serta (4) implementasi kontroler PID pada platform FPGA untuk waktu cuplik yang lebih cepat. Penelitian ini diharapkan dapat menjadi acuan bagi praktisi industri dalam merancang sistem kendali robot las yang presisi dan hemat biaya.</w:t>
+        <w:t>Langkah selanjutnya menuntut fabrikasi prototipe fisik. Kami berencana menguji ketahanan lapisan perovskit-TRC di bawah paparan kelembaban tropis selama 12 bulan penuh. Jika materialnya bertahan, sel ini bisa mengubah setiap atap menjadi pembangkit listrik yang tak pernah tidur, mendefinisikan ulang cara kita memanen energi dari alam semesta.</w:t>
       </w:r>
     </w:p>
     <w:p>
@@ -3314,7 +1962,7 @@
         <w:rPr>
           <w:i/>
         </w:rPr>
-        <w:t>[⚠️ Note: Only 20 references provided. IJT requires minimum 36 references for Regular Article. Add 16 more references to comply with template requirements.]</w:t>
+        <w:t>[⚠️ Note: Only 1 references provided. IJT requires minimum 36 references for Regular Article. Add 35 more references to comply with template requirements.]</w:t>
       </w:r>
     </w:p>
     <w:p>
@@ -3322,159 +1970,7 @@
         <w:pStyle w:val="IJTechText"/>
       </w:pPr>
       <w:r>
-        <w:t>Astrom (2006) 'K. J. and Hagglund' T., Advanced PID Control. Research Triangle Park, NC, USA: ISA-The Instrumentation, Systems, and Automation Society.</w:t>
-      </w:r>
-    </w:p>
-    <w:p>
-      <w:pPr>
-        <w:pStyle w:val="IJTechText"/>
-      </w:pPr>
-      <w:r>
-        <w:t>Chen, Q. and Li, Y (2020) 'Neural network based PID control for friction compensation in robot joints' in Proc. Proc. IEEE Int. Conf. Mechatronics and Automation (ICMA), 2020, pp. 1573-1578 doi: 10.1109/ICMA49215.2020.9233751.</w:t>
-      </w:r>
-    </w:p>
-    <w:p>
-      <w:pPr>
-        <w:pStyle w:val="IJTechText"/>
-      </w:pPr>
-      <w:r>
-        <w:t>Chen, W. and Zhao, J (2023) 'Feedforward compensation for PID control of robot manipulators under variable payload' IEEE Robot. Autom. Lett., vol. 8, no. 3, pp. 1578-1585 doi: 10.1109/LRA.2023.3242126.</w:t>
-      </w:r>
-    </w:p>
-    <w:p>
-      <w:pPr>
-        <w:pStyle w:val="IJTechText"/>
-      </w:pPr>
-      <w:r>
-        <w:t>Craig, J. J (2005) Introduction to Robotics: Mechanics and Control. Upper Saddle River NJ, USA: Pearson.</w:t>
-      </w:r>
-    </w:p>
-    <w:p>
-      <w:pPr>
-        <w:pStyle w:val="IJTechText"/>
-      </w:pPr>
-      <w:r>
-        <w:t>Fanuc Corporation. (2021). M-710iC Series Robot Specifications Manual. [Online]. Available: https://www.fanuc.co.jp/en/product/robot/m710ic.html (Accessed: 15 Mar. 2024) (2024).</w:t>
-      </w:r>
-    </w:p>
-    <w:p>
-      <w:pPr>
-        <w:pStyle w:val="IJTechText"/>
-      </w:pPr>
-      <w:r>
-        <w:t>Franklin, G. F (2014) 'Powell' J. D., and Workman, M. L., Digital Control of Dynamic Systems. Reading, MA, USA: Addison-Wesley.</w:t>
-      </w:r>
-    </w:p>
-    <w:p>
-      <w:pPr>
-        <w:pStyle w:val="IJTechText"/>
-      </w:pPr>
-      <w:r>
-        <w:t>Gonzalez, L. M. and Patel, R. V (2017) 'Robust H-infinity control for robotic welding under disturbances' IEEE Trans. Ind. Electron., vol. 64, no. 8, pp. 6400-6408 doi: 10.1109/TIE.2017.2694421.</w:t>
-      </w:r>
-    </w:p>
-    <w:p>
-      <w:pPr>
-        <w:pStyle w:val="IJTechText"/>
-      </w:pPr>
-      <w:r>
-        <w:t>Kadir, R. and Sharif, S (2015) 'Kendali posisi lengan robot industri menggunakan PID' Jurnal Teknik Mesin Indonesia, vol. 7, no. 2, pp. 75-82 doi: 10.1234/jtmi.v7i2.2015.</w:t>
-      </w:r>
-    </w:p>
-    <w:p>
-      <w:pPr>
-        <w:pStyle w:val="IJTechText"/>
-      </w:pPr>
-      <w:r>
-        <w:t>Kim, J. and Lee, S (2018) 'PID parameter tuning for robot manipulator using particle swarm optimization' in Proc. Proc. IEEE Int. Conf. Robotics and Automation (ICRA), 2018, pp. 210-215 doi: 10.1109/ICRA.2018.8463156.</w:t>
-      </w:r>
-    </w:p>
-    <w:p>
-      <w:pPr>
-        <w:pStyle w:val="IJTechText"/>
-      </w:pPr>
-      <w:r>
-        <w:t>Kumar, A., Singh, R., and Sharma, P (2021) 'Comparison of PID and fuzzy logic control for a welding robot arm' Int. J. Adv. Manuf. Technol., vol. 112, no. 5-6, pp. 1561-1575 doi: 10.1007/s00170-020-06437-x.</w:t>
-      </w:r>
-    </w:p>
-    <w:p>
-      <w:pPr>
-        <w:pStyle w:val="IJTechText"/>
-      </w:pPr>
-      <w:r>
-        <w:t>Liu, X. and Zhang, Q (2021) 'Iterative feedback tuning of PID gains for industrial robot joints' in Proc. Proc. IEEE Int. Conf. Industrial Electronics (IECON), 2021, pp. 1452-1457 doi: 10.1109/IECON48115.2021.9589567.</w:t>
-      </w:r>
-    </w:p>
-    <w:p>
-      <w:pPr>
-        <w:pStyle w:val="IJTechText"/>
-      </w:pPr>
-      <w:r>
-        <w:t>Nof, S. Y (2009) Handbook of Automation. Berlin Germany: Springer.</w:t>
-      </w:r>
-    </w:p>
-    <w:p>
-      <w:pPr>
-        <w:pStyle w:val="IJTechText"/>
-      </w:pPr>
-      <w:r>
-        <w:t>Ogata (2010) K Modern Control Engineering. Upper Saddle River, NJ, USA: Prentice Hall.</w:t>
-      </w:r>
-    </w:p>
-    <w:p>
-      <w:pPr>
-        <w:pStyle w:val="IJTechText"/>
-      </w:pPr>
-      <w:r>
-        <w:t>Park, H. and Kim, S (2022) 'PSO-based auto-tuning of PID for SCARA robot trajectory tracking' in Proc. Proc. IEEE Int. Conf. Robotics and Automation (ICRA), 2022, pp. 8918-8924 doi: 10.1109/ICRA46639.2022.9812021.</w:t>
-      </w:r>
-    </w:p>
-    <w:p>
-      <w:pPr>
-        <w:pStyle w:val="IJTechText"/>
-      </w:pPr>
-      <w:r>
-        <w:t>Purnomo, D. and Santoso, B (2020) 'Analisis kendali PID pada robot pengelasan menggunakan metode Ziegler-Nichols' Jurnal Rekayasa Elektrika, vol. 16, no. 1, pp. 33-40 doi: 10.17529/jre.v16i1.16234.</w:t>
-      </w:r>
-    </w:p>
-    <w:p>
-      <w:pPr>
-        <w:pStyle w:val="IJTechText"/>
-      </w:pPr>
-      <w:r>
-        <w:t>Siciliano (2009) B Sciavicco, L., Villani, L., and Oriolo, G., Robotics: Modelling, Planning and Control. London, UK: Springer.</w:t>
-      </w:r>
-    </w:p>
-    <w:p>
-      <w:pPr>
-        <w:pStyle w:val="IJTechText"/>
-      </w:pPr>
-      <w:r>
-        <w:t>Smith, J. A. and Brown, M. L (2019) 'Adaptive PID control of a 3-DOF robotic arm using recursive least squares' IEEE Trans. Control Syst. Technol., vol. 27, no. 4, pp. 1455-1462 doi: 10.1109/TCST.2018.2853642.</w:t>
-      </w:r>
-    </w:p>
-    <w:p>
-      <w:pPr>
-        <w:pStyle w:val="IJTechText"/>
-      </w:pPr>
-      <w:r>
-        <w:t>Visioli (2006) A Practical PID Control. London, UK: Springer.</w:t>
-      </w:r>
-    </w:p>
-    <w:p>
-      <w:pPr>
-        <w:pStyle w:val="IJTechText"/>
-      </w:pPr>
-      <w:r>
-        <w:t>Wang, Z. and Liu, Y (2016) 'Kinematic modeling and simulation of a 6-DOF industrial robot using Matlab' Int. J. Eng. Res. Technol., vol. 5, no. 8, pp. 45-51 doi: 10.17577/IJERTV5IS080382.</w:t>
-      </w:r>
-    </w:p>
-    <w:p>
-      <w:pPr>
-        <w:pStyle w:val="IJTechText"/>
-      </w:pPr>
-      <w:r>
-        <w:t>Ziegler, J. G. and Nichols, N. B (1942) 'Optimum settings for automatic controllers' Trans. ASME, vol. 64, pp. 759-768.</w:t>
+        <w:t>Author, A., Title of Article. Journal Name, vol. X, no. Y, pp. Z, Year. doi:10.xxxx/xxxxx</w:t>
       </w:r>
     </w:p>
     <w:p>

</xml_diff>